<commit_message>
Add Hearth Coffee Co. Shopify project, update resume
Adds a featured "E-commerce / CMS" project card showcasing custom
Shopify theme development (Dawn-based, custom quiz section) plus a
self-built Node.js/Express recommender API, aimed at roles requiring
WordPress/WooCommerce/Shopify experience. Also picks up the latest
resume files and ignores INTERVIEW.md.

Co-Authored-By: Claude Sonnet 5 <noreply@anthropic.com>
</commit_message>
<xml_diff>
--- a/public/Khine_Zar_Thwe_Resume.docx
+++ b/public/Khine_Zar_Thwe_Resume.docx
@@ -1,6 +1,6 @@
 
 <file path=word/document.xml><?xml version="1.0" encoding="utf-8"?>
-<w:document xmlns:wpc="http://schemas.microsoft.com/office/word/2010/wordprocessingCanvas" xmlns:cx="http://schemas.microsoft.com/office/drawing/2014/chartex" xmlns:cx1="http://schemas.microsoft.com/office/drawing/2015/9/8/chartex" xmlns:cx2="http://schemas.microsoft.com/office/drawing/2015/10/21/chartex" xmlns:cx3="http://schemas.microsoft.com/office/drawing/2016/5/9/chartex" xmlns:cx4="http://schemas.microsoft.com/office/drawing/2016/5/10/chartex" xmlns:cx5="http://schemas.microsoft.com/office/drawing/2016/5/11/chartex" xmlns:cx6="http://schemas.microsoft.com/office/drawing/2016/5/12/chartex" xmlns:cx7="http://schemas.microsoft.com/office/drawing/2016/5/13/chartex" xmlns:cx8="http://schemas.microsoft.com/office/drawing/2016/5/14/chartex" xmlns:mc="http://schemas.openxmlformats.org/markup-compatibility/2006" xmlns:aink="http://schemas.microsoft.com/office/drawing/2016/ink" xmlns:am3d="http://schemas.microsoft.com/office/drawing/2017/model3d" xmlns:o="urn:schemas-microsoft-com:office:office" xmlns:oel="http://schemas.microsoft.com/office/2019/extlst" xmlns:r="http://schemas.openxmlformats.org/officeDocument/2006/relationships" xmlns:m="http://schemas.openxmlformats.org/officeDocument/2006/math" xmlns:v="urn:schemas-microsoft-com:vml" xmlns:wp14="http://schemas.microsoft.com/office/word/2010/wordprocessingDrawing" xmlns:wp="http://schemas.openxmlformats.org/drawingml/2006/wordprocessingDrawing" xmlns:w10="urn:schemas-microsoft-com:office:word" xmlns:w="http://schemas.openxmlformats.org/wordprocessingml/2006/main" xmlns:w14="http://schemas.microsoft.com/office/word/2010/wordml" xmlns:w15="http://schemas.microsoft.com/office/word/2012/wordml" xmlns:w16cex="http://schemas.microsoft.com/office/word/2018/wordml/cex" xmlns:w16cid="http://schemas.microsoft.com/office/word/2016/wordml/cid" xmlns:w16="http://schemas.microsoft.com/office/word/2018/wordml" xmlns:w16du="http://schemas.microsoft.com/office/word/2023/wordml/word16du" xmlns:w16sdtdh="http://schemas.microsoft.com/office/word/2020/wordml/sdtdatahash" xmlns:w16sdtfl="http://schemas.microsoft.com/office/word/2024/wordml/sdtformatlock" xmlns:w16se="http://schemas.microsoft.com/office/word/2015/wordml/symex" xmlns:wpg="http://schemas.microsoft.com/office/word/2010/wordprocessingGroup" xmlns:wpi="http://schemas.microsoft.com/office/word/2010/wordprocessingInk" xmlns:wne="http://schemas.microsoft.com/office/word/2006/wordml" xmlns:wps="http://schemas.microsoft.com/office/word/2010/wordprocessingShape" mc:Ignorable="w14 w15 w16se w16cid w16 w16cex w16sdtdh w16sdtfl w16du wp14">
+<w:document xmlns:wpc="http://schemas.microsoft.com/office/word/2010/wordprocessingCanvas" xmlns:cx="http://schemas.microsoft.com/office/drawing/2014/chartex" xmlns:cx1="http://schemas.microsoft.com/office/drawing/2015/9/8/chartex" xmlns:cx2="http://schemas.microsoft.com/office/drawing/2015/10/21/chartex" xmlns:cx3="http://schemas.microsoft.com/office/drawing/2016/5/9/chartex" xmlns:cx4="http://schemas.microsoft.com/office/drawing/2016/5/10/chartex" xmlns:cx5="http://schemas.microsoft.com/office/drawing/2016/5/11/chartex" xmlns:cx6="http://schemas.microsoft.com/office/drawing/2016/5/12/chartex" xmlns:cx7="http://schemas.microsoft.com/office/drawing/2016/5/13/chartex" xmlns:cx8="http://schemas.microsoft.com/office/drawing/2016/5/14/chartex" xmlns:mc="http://schemas.openxmlformats.org/markup-compatibility/2006" xmlns:o="urn:schemas-microsoft-com:office:office" xmlns:r="http://schemas.openxmlformats.org/officeDocument/2006/relationships" xmlns:m="http://schemas.openxmlformats.org/officeDocument/2006/math" xmlns:v="urn:schemas-microsoft-com:vml" xmlns:wp14="http://schemas.microsoft.com/office/word/2010/wordprocessingDrawing" xmlns:wp="http://schemas.openxmlformats.org/drawingml/2006/wordprocessingDrawing" xmlns:w="http://schemas.openxmlformats.org/wordprocessingml/2006/main" xmlns:w14="http://schemas.microsoft.com/office/word/2010/wordml" xmlns:w10="urn:schemas-microsoft-com:office:word" xmlns:w15="http://schemas.microsoft.com/office/word/2012/wordml" xmlns:wpg="http://schemas.microsoft.com/office/word/2010/wordprocessingGroup" xmlns:wpi="http://schemas.microsoft.com/office/word/2010/wordprocessingInk" xmlns:wne="http://schemas.microsoft.com/office/word/2006/wordml" xmlns:wps="http://schemas.microsoft.com/office/word/2010/wordprocessingShape" xmlns:wpsCustomData="http://www.wps.cn/officeDocument/2013/wpsCustomData" mc:Ignorable="w14 w15 wp14">
   <w:body>
     <w:p>
       <w:pPr>
@@ -36,65 +36,115 @@
         <w:spacing w:after="120"/>
         <w:jc w:val="center"/>
       </w:pPr>
-      <w:hyperlink w:history="1">
-        <w:r>
-          <w:rPr>
-            <w:color w:val="0563C1"/>
-            <w:u w:val="single"/>
-          </w:rPr>
-          <w:t>khinezarthwe282@gmail.com</w:t>
-        </w:r>
-      </w:hyperlink>
+      <w:r>
+        <w:fldChar w:fldCharType="begin"/>
+      </w:r>
+      <w:r>
+        <w:instrText xml:space="preserve"> HYPERLINK </w:instrText>
+      </w:r>
+      <w:r>
+        <w:fldChar w:fldCharType="separate"/>
+      </w:r>
+      <w:r>
+        <w:rPr>
+          <w:color w:val="0563C1"/>
+          <w:u w:val="single"/>
+        </w:rPr>
+        <w:t>khinezarthwe282@gmail.com</w:t>
+      </w:r>
+      <w:r>
+        <w:rPr>
+          <w:color w:val="0563C1"/>
+          <w:u w:val="single"/>
+        </w:rPr>
+        <w:fldChar w:fldCharType="end"/>
+      </w:r>
       <w:r>
         <w:rPr>
           <w:color w:val="7F8C8D"/>
         </w:rPr>
         <w:t xml:space="preserve"> | </w:t>
       </w:r>
-      <w:hyperlink w:history="1">
-        <w:r>
-          <w:rPr>
-            <w:color w:val="0563C1"/>
-            <w:u w:val="single"/>
-          </w:rPr>
-          <w:t>LinkedIn</w:t>
-        </w:r>
-      </w:hyperlink>
+      <w:r>
+        <w:fldChar w:fldCharType="begin"/>
+      </w:r>
+      <w:r>
+        <w:instrText xml:space="preserve"> HYPERLINK "https://www.linkedin.com/in/khine-zar-thwe-282kzt/" </w:instrText>
+      </w:r>
+      <w:r>
+        <w:fldChar w:fldCharType="separate"/>
+      </w:r>
+      <w:r>
+        <w:rPr>
+          <w:rStyle w:val="12"/>
+        </w:rPr>
+        <w:t xml:space="preserve">LinkedIn </w:t>
+      </w:r>
+      <w:r>
+        <w:rPr>
+          <w:rStyle w:val="12"/>
+        </w:rPr>
+        <w:fldChar w:fldCharType="end"/>
+      </w:r>
       <w:r>
         <w:rPr>
           <w:color w:val="7F8C8D"/>
         </w:rPr>
-        <w:t xml:space="preserve"> | </w:t>
-      </w:r>
-      <w:hyperlink w:history="1">
-        <w:r>
-          <w:rPr>
-            <w:color w:val="0563C1"/>
-            <w:u w:val="single"/>
-          </w:rPr>
-          <w:t>GitHub</w:t>
-        </w:r>
-      </w:hyperlink>
+        <w:t xml:space="preserve">| </w:t>
+      </w:r>
+      <w:r>
+        <w:fldChar w:fldCharType="begin"/>
+      </w:r>
+      <w:r>
+        <w:instrText xml:space="preserve"> HYPERLINK "https://github.com/khine282" </w:instrText>
+      </w:r>
+      <w:r>
+        <w:fldChar w:fldCharType="separate"/>
+      </w:r>
+      <w:r>
+        <w:rPr>
+          <w:rStyle w:val="15"/>
+        </w:rPr>
+        <w:t xml:space="preserve">GitHub </w:t>
+      </w:r>
+      <w:r>
+        <w:rPr>
+          <w:rStyle w:val="15"/>
+        </w:rPr>
+        <w:fldChar w:fldCharType="end"/>
+      </w:r>
       <w:r>
         <w:rPr>
           <w:color w:val="7F8C8D"/>
         </w:rPr>
-        <w:t xml:space="preserve"> | </w:t>
-      </w:r>
-      <w:hyperlink w:history="1">
-        <w:r>
-          <w:rPr>
-            <w:color w:val="0563C1"/>
-            <w:u w:val="single"/>
-          </w:rPr>
-          <w:t>Portfolio</w:t>
-        </w:r>
-      </w:hyperlink>
+        <w:t xml:space="preserve">| </w:t>
+      </w:r>
+      <w:r>
+        <w:fldChar w:fldCharType="begin"/>
+      </w:r>
+      <w:r>
+        <w:instrText xml:space="preserve"> HYPERLINK "https://kaizarthwe.com/" </w:instrText>
+      </w:r>
+      <w:r>
+        <w:fldChar w:fldCharType="separate"/>
+      </w:r>
+      <w:r>
+        <w:rPr>
+          <w:rStyle w:val="12"/>
+        </w:rPr>
+        <w:t>Portfolio</w:t>
+      </w:r>
+      <w:r>
+        <w:rPr>
+          <w:rStyle w:val="12"/>
+        </w:rPr>
+        <w:fldChar w:fldCharType="end"/>
+      </w:r>
     </w:p>
     <w:p>
       <w:pPr>
         <w:pBdr>
-          <w:bottom w:val="single" w:sz="6" w:space="1" w:color="1F4E78"/>
+          <w:bottom w:val="single" w:color="1F4E78" w:sz="6" w:space="1"/>
         </w:pBdr>
         <w:spacing w:before="240" w:after="120"/>
       </w:pPr>
@@ -114,27 +164,13 @@
         <w:spacing w:after="40"/>
       </w:pPr>
       <w:r>
-        <w:t xml:space="preserve">IT graduate and full-stack developer specialising in Java and Spring Boot enterprise systems, React Native mobile apps (shipped to Google Play and TestFlight), and Python AI/ML workflows using TensorFlow and OpenCV. Backed by hands-on QA/testing practice, Android Studio and Xcode delivery, and production experience at </w:t>
-      </w:r>
-      <w:proofErr w:type="spellStart"/>
-      <w:r>
-        <w:t>Reachfield</w:t>
-      </w:r>
-      <w:proofErr w:type="spellEnd"/>
-      <w:r>
-        <w:t xml:space="preserve"> IT Solutions, Singapore</w:t>
-      </w:r>
-      <w:r>
-        <w:t xml:space="preserve">.  </w:t>
-      </w:r>
-      <w:r>
-        <w:t>Currently working towards the AWS Solutions Architect Associate certification, with a growing focus on AI and cloud development.</w:t>
+        <w:t>IT graduate and full-stack developer specialising in Java and Spring Boot enterprise systems, React Native mobile apps (shipped to Google Play and TestFlight), and Python AI/ML workflows using TensorFlow and OpenCV. Backed by hands-on QA/testing practice, Android Studio and Xcode delivery, and production experience at Reachfield IT Solutions, Singapore.  Currently working towards the AWS Solutions Architect Associate certification, with a growing focus on AI and cloud development.</w:t>
       </w:r>
     </w:p>
     <w:p>
       <w:pPr>
         <w:pBdr>
-          <w:bottom w:val="single" w:sz="6" w:space="1" w:color="1F4E78"/>
+          <w:bottom w:val="single" w:color="1F4E78" w:sz="6" w:space="1"/>
         </w:pBdr>
         <w:spacing w:before="240" w:after="120"/>
       </w:pPr>
@@ -168,23 +204,13 @@
       <w:pPr>
         <w:spacing w:after="20"/>
       </w:pPr>
-      <w:proofErr w:type="spellStart"/>
       <w:r>
         <w:rPr>
           <w:color w:val="7F8C8D"/>
           <w:sz w:val="20"/>
           <w:szCs w:val="20"/>
         </w:rPr>
-        <w:t>Reachfield</w:t>
-      </w:r>
-      <w:proofErr w:type="spellEnd"/>
-      <w:r>
-        <w:rPr>
-          <w:color w:val="7F8C8D"/>
-          <w:sz w:val="20"/>
-          <w:szCs w:val="20"/>
-        </w:rPr>
-        <w:t xml:space="preserve"> IT Solutions, Singapore | Apr 2025 – Apr 2026 (1 year)</w:t>
+        <w:t>Reachfield IT Solutions, Singapore | Apr 2025 – Apr 2026 (1 year)</w:t>
       </w:r>
     </w:p>
     <w:p>
@@ -194,7 +220,7 @@
     </w:p>
     <w:p>
       <w:pPr>
-        <w:pStyle w:val="ListParagraph"/>
+        <w:pStyle w:val="17"/>
         <w:numPr>
           <w:ilvl w:val="0"/>
           <w:numId w:val="1"/>
@@ -210,7 +236,7 @@
     </w:p>
     <w:p>
       <w:pPr>
-        <w:pStyle w:val="ListParagraph"/>
+        <w:pStyle w:val="17"/>
         <w:numPr>
           <w:ilvl w:val="0"/>
           <w:numId w:val="1"/>
@@ -226,7 +252,7 @@
     </w:p>
     <w:p>
       <w:pPr>
-        <w:pStyle w:val="ListParagraph"/>
+        <w:pStyle w:val="17"/>
         <w:numPr>
           <w:ilvl w:val="0"/>
           <w:numId w:val="1"/>
@@ -242,7 +268,7 @@
     </w:p>
     <w:p>
       <w:pPr>
-        <w:pStyle w:val="ListParagraph"/>
+        <w:pStyle w:val="17"/>
         <w:numPr>
           <w:ilvl w:val="0"/>
           <w:numId w:val="1"/>
@@ -258,7 +284,7 @@
     </w:p>
     <w:p>
       <w:pPr>
-        <w:pStyle w:val="ListParagraph"/>
+        <w:pStyle w:val="17"/>
         <w:numPr>
           <w:ilvl w:val="0"/>
           <w:numId w:val="1"/>
@@ -274,7 +300,7 @@
     </w:p>
     <w:p>
       <w:pPr>
-        <w:pStyle w:val="ListParagraph"/>
+        <w:pStyle w:val="17"/>
         <w:numPr>
           <w:ilvl w:val="0"/>
           <w:numId w:val="1"/>
@@ -285,26 +311,12 @@
         <w:rPr>
           <w:color w:val="2C3E50"/>
         </w:rPr>
-        <w:t xml:space="preserve">Developed </w:t>
-      </w:r>
-      <w:proofErr w:type="spellStart"/>
-      <w:r>
-        <w:rPr>
-          <w:color w:val="2C3E50"/>
-        </w:rPr>
-        <w:t>FastAPI</w:t>
-      </w:r>
-      <w:proofErr w:type="spellEnd"/>
-      <w:r>
-        <w:rPr>
-          <w:color w:val="2C3E50"/>
-        </w:rPr>
-        <w:t xml:space="preserve"> Python microservices for real-time emotion detection (7-class custom CNN model) and crowd density analysis; deployed containerised inference servers on Render with async request handling.</w:t>
-      </w:r>
-    </w:p>
-    <w:p>
-      <w:pPr>
-        <w:pStyle w:val="ListParagraph"/>
+        <w:t>Developed FastAPI Python microservices for real-time emotion detection (7-class custom CNN model) and crowd density analysis; deployed containerised inference servers on Render with async request handling.</w:t>
+      </w:r>
+    </w:p>
+    <w:p>
+      <w:pPr>
+        <w:pStyle w:val="17"/>
         <w:numPr>
           <w:ilvl w:val="0"/>
           <w:numId w:val="1"/>
@@ -326,29 +338,46 @@
     <w:p>
       <w:pPr>
         <w:pBdr>
-          <w:bottom w:val="single" w:sz="6" w:space="1" w:color="1F4E78"/>
+          <w:bottom w:val="single" w:color="1F4E78" w:sz="6" w:space="1"/>
         </w:pBdr>
         <w:spacing w:before="240" w:after="120"/>
       </w:pPr>
-      <w:hyperlink w:history="1">
-        <w:r>
-          <w:rPr>
-            <w:b/>
-            <w:bCs/>
-            <w:color w:val="0563C1"/>
-            <w:sz w:val="28"/>
-            <w:szCs w:val="28"/>
-            <w:u w:val="single"/>
-          </w:rPr>
-          <w:t>FEATURED PROJECTS</w:t>
-        </w:r>
-      </w:hyperlink>
+      <w:r>
+        <w:fldChar w:fldCharType="begin"/>
+      </w:r>
+      <w:r>
+        <w:instrText xml:space="preserve"> HYPERLINK </w:instrText>
+      </w:r>
+      <w:r>
+        <w:fldChar w:fldCharType="separate"/>
+      </w:r>
+      <w:r>
+        <w:rPr>
+          <w:b/>
+          <w:bCs/>
+          <w:color w:val="0563C1"/>
+          <w:sz w:val="28"/>
+          <w:szCs w:val="28"/>
+          <w:u w:val="single"/>
+        </w:rPr>
+        <w:t>FEATURED PROJECTS</w:t>
+      </w:r>
+      <w:r>
+        <w:rPr>
+          <w:b/>
+          <w:bCs/>
+          <w:color w:val="0563C1"/>
+          <w:sz w:val="28"/>
+          <w:szCs w:val="28"/>
+          <w:u w:val="single"/>
+        </w:rPr>
+        <w:fldChar w:fldCharType="end"/>
+      </w:r>
     </w:p>
     <w:p>
       <w:pPr>
         <w:spacing w:before="120" w:after="60"/>
       </w:pPr>
-      <w:proofErr w:type="spellStart"/>
       <w:r>
         <w:rPr>
           <w:b/>
@@ -357,18 +386,7 @@
           <w:sz w:val="24"/>
           <w:szCs w:val="24"/>
         </w:rPr>
-        <w:t>GlucoSG</w:t>
-      </w:r>
-      <w:proofErr w:type="spellEnd"/>
-      <w:r>
-        <w:rPr>
-          <w:b/>
-          <w:bCs/>
-          <w:color w:val="2C3E50"/>
-          <w:sz w:val="24"/>
-          <w:szCs w:val="24"/>
-        </w:rPr>
-        <w:t xml:space="preserve"> — Full-Stack Nutrition Tracking App</w:t>
+        <w:t>GlucoSG — Full-Stack Nutrition Tracking App</w:t>
       </w:r>
     </w:p>
     <w:p>
@@ -389,25 +407,31 @@
         <w:spacing w:after="80"/>
       </w:pPr>
       <w:r>
-        <w:t xml:space="preserve">Full-stack nutrition tracking app for diabetic population. React/Vite frontend, Node/Express backend, </w:t>
-      </w:r>
-      <w:proofErr w:type="spellStart"/>
-      <w:r>
-        <w:t>Supabase</w:t>
-      </w:r>
-      <w:proofErr w:type="spellEnd"/>
-      <w:r>
-        <w:t xml:space="preserve"> (PostgreSQL, Realtime Auth). Tested and validated app across platforms. </w:t>
-      </w:r>
-      <w:hyperlink w:history="1">
-        <w:r>
-          <w:rPr>
-            <w:color w:val="0563C1"/>
-            <w:u w:val="single"/>
-          </w:rPr>
-          <w:t>View on GitHub</w:t>
-        </w:r>
-      </w:hyperlink>
+        <w:t xml:space="preserve">Full-stack nutrition tracking app for diabetic population. React/Vite frontend, Node/Express backend, Supabase (PostgreSQL, Realtime Auth). Tested and validated app across platforms. </w:t>
+      </w:r>
+      <w:r>
+        <w:fldChar w:fldCharType="begin"/>
+      </w:r>
+      <w:r>
+        <w:instrText xml:space="preserve"> HYPERLINK </w:instrText>
+      </w:r>
+      <w:r>
+        <w:fldChar w:fldCharType="separate"/>
+      </w:r>
+      <w:r>
+        <w:rPr>
+          <w:color w:val="0563C1"/>
+          <w:u w:val="single"/>
+        </w:rPr>
+        <w:t>View on GitHub</w:t>
+      </w:r>
+      <w:r>
+        <w:rPr>
+          <w:color w:val="0563C1"/>
+          <w:u w:val="single"/>
+        </w:rPr>
+        <w:fldChar w:fldCharType="end"/>
+      </w:r>
     </w:p>
     <w:p>
       <w:pPr>
@@ -454,33 +478,60 @@
       <w:r>
         <w:t xml:space="preserve">AWS-native app: paste code → architecture diagram with cost estimates. React frontend, Python Lambda functions, API Gateway, Claude Bedrock. </w:t>
       </w:r>
-      <w:hyperlink w:history="1">
-        <w:r>
-          <w:rPr>
-            <w:color w:val="0563C1"/>
-            <w:u w:val="single"/>
-          </w:rPr>
-          <w:t>Live Demo</w:t>
-        </w:r>
-      </w:hyperlink>
+      <w:r>
+        <w:fldChar w:fldCharType="begin"/>
+      </w:r>
+      <w:r>
+        <w:instrText xml:space="preserve"> HYPERLINK </w:instrText>
+      </w:r>
+      <w:r>
+        <w:fldChar w:fldCharType="separate"/>
+      </w:r>
+      <w:r>
+        <w:rPr>
+          <w:color w:val="0563C1"/>
+          <w:u w:val="single"/>
+        </w:rPr>
+        <w:t>Live Demo</w:t>
+      </w:r>
+      <w:r>
+        <w:rPr>
+          <w:color w:val="0563C1"/>
+          <w:u w:val="single"/>
+        </w:rPr>
+        <w:fldChar w:fldCharType="end"/>
+      </w:r>
       <w:r>
         <w:t xml:space="preserve"> | </w:t>
       </w:r>
-      <w:hyperlink w:history="1">
-        <w:r>
-          <w:rPr>
-            <w:color w:val="0563C1"/>
-            <w:u w:val="single"/>
-          </w:rPr>
-          <w:t>GitHub</w:t>
-        </w:r>
-      </w:hyperlink>
+      <w:r>
+        <w:fldChar w:fldCharType="begin"/>
+      </w:r>
+      <w:r>
+        <w:instrText xml:space="preserve"> HYPERLINK </w:instrText>
+      </w:r>
+      <w:r>
+        <w:fldChar w:fldCharType="separate"/>
+      </w:r>
+      <w:r>
+        <w:rPr>
+          <w:color w:val="0563C1"/>
+          <w:u w:val="single"/>
+        </w:rPr>
+        <w:t>GitHub</w:t>
+      </w:r>
+      <w:r>
+        <w:rPr>
+          <w:color w:val="0563C1"/>
+          <w:u w:val="single"/>
+        </w:rPr>
+        <w:fldChar w:fldCharType="end"/>
+      </w:r>
     </w:p>
     <w:p>
       <w:pPr>
         <w:spacing w:before="120" w:after="60"/>
       </w:pPr>
-      <w:proofErr w:type="spellStart"/>
       <w:r>
         <w:rPr>
           <w:b/>
@@ -489,9 +540,44 @@
           <w:sz w:val="24"/>
           <w:szCs w:val="24"/>
         </w:rPr>
-        <w:t>EmotionVision</w:t>
-      </w:r>
-      <w:proofErr w:type="spellEnd"/>
+        <w:t>EmotionVision — Real-Time Emotion Detection</w:t>
+      </w:r>
+    </w:p>
+    <w:p>
+      <w:pPr>
+        <w:spacing w:after="80"/>
+      </w:pPr>
+      <w:r>
+        <w:t xml:space="preserve">Custom TensorFlow CNN model (7-class emotion classification), OpenCV video pipeline, FastAPI microservices, Docker containerisation. Real-time emotion detection and crowd density analysis. </w:t>
+      </w:r>
+      <w:r>
+        <w:fldChar w:fldCharType="begin"/>
+      </w:r>
+      <w:r>
+        <w:instrText xml:space="preserve"> HYPERLINK </w:instrText>
+      </w:r>
+      <w:r>
+        <w:fldChar w:fldCharType="separate"/>
+      </w:r>
+      <w:r>
+        <w:rPr>
+          <w:color w:val="0563C1"/>
+          <w:u w:val="single"/>
+        </w:rPr>
+        <w:t>GitHub</w:t>
+      </w:r>
+      <w:r>
+        <w:rPr>
+          <w:color w:val="0563C1"/>
+          <w:u w:val="single"/>
+        </w:rPr>
+        <w:fldChar w:fldCharType="end"/>
+      </w:r>
+    </w:p>
+    <w:p>
+      <w:pPr>
+        <w:spacing w:before="120" w:after="60"/>
+      </w:pPr>
       <w:r>
         <w:rPr>
           <w:b/>
@@ -500,47 +586,6 @@
           <w:sz w:val="24"/>
           <w:szCs w:val="24"/>
         </w:rPr>
-        <w:t xml:space="preserve"> — Real-Time Emotion Detection</w:t>
-      </w:r>
-    </w:p>
-    <w:p>
-      <w:pPr>
-        <w:spacing w:after="80"/>
-      </w:pPr>
-      <w:r>
-        <w:t xml:space="preserve">Custom TensorFlow CNN model (7-class emotion classification), OpenCV video pipeline, </w:t>
-      </w:r>
-      <w:proofErr w:type="spellStart"/>
-      <w:r>
-        <w:t>FastAPI</w:t>
-      </w:r>
-      <w:proofErr w:type="spellEnd"/>
-      <w:r>
-        <w:t xml:space="preserve"> microservices, Docker containerisation. Real-time emotion detection and crowd density analysis. </w:t>
-      </w:r>
-      <w:hyperlink w:history="1">
-        <w:r>
-          <w:rPr>
-            <w:color w:val="0563C1"/>
-            <w:u w:val="single"/>
-          </w:rPr>
-          <w:t>GitHub</w:t>
-        </w:r>
-      </w:hyperlink>
-    </w:p>
-    <w:p>
-      <w:pPr>
-        <w:spacing w:before="120" w:after="60"/>
-      </w:pPr>
-      <w:r>
-        <w:rPr>
-          <w:b/>
-          <w:bCs/>
-          <w:color w:val="2C3E50"/>
-          <w:sz w:val="24"/>
-          <w:szCs w:val="24"/>
-        </w:rPr>
-        <w:lastRenderedPageBreak/>
         <w:t>SGEMS2 Enterprise Platform</w:t>
       </w:r>
     </w:p>
@@ -563,7 +608,7 @@
     <w:p>
       <w:pPr>
         <w:pBdr>
-          <w:bottom w:val="single" w:sz="6" w:space="1" w:color="1F4E78"/>
+          <w:bottom w:val="single" w:color="1F4E78" w:sz="6" w:space="1"/>
         </w:pBdr>
         <w:spacing w:before="240" w:after="120"/>
       </w:pPr>
@@ -611,15 +656,7 @@
         <w:t xml:space="preserve">Backend &amp; Systems: </w:t>
       </w:r>
       <w:r>
-        <w:t xml:space="preserve">Jakarta EE, Spring Boot, Node.js/Express, </w:t>
-      </w:r>
-      <w:proofErr w:type="spellStart"/>
-      <w:r>
-        <w:t>FastAPI</w:t>
-      </w:r>
-      <w:proofErr w:type="spellEnd"/>
-      <w:r>
-        <w:t>, Hibernate, REST APIs</w:t>
+        <w:t>Jakarta EE, Spring Boot, Node.js/Express, FastAPI, Hibernate, REST APIs</w:t>
       </w:r>
     </w:p>
     <w:p>
@@ -631,15 +668,7 @@
         <w:t xml:space="preserve">AI &amp; Vision: </w:t>
       </w:r>
       <w:r>
-        <w:t xml:space="preserve">TensorFlow, OpenCV, </w:t>
-      </w:r>
-      <w:proofErr w:type="spellStart"/>
-      <w:r>
-        <w:t>MediaPipe</w:t>
-      </w:r>
-      <w:proofErr w:type="spellEnd"/>
-      <w:r>
-        <w:t>, YOLO, CNN models</w:t>
+        <w:t>TensorFlow, OpenCV, MediaPipe, YOLO, CNN models</w:t>
       </w:r>
     </w:p>
     <w:p>
@@ -663,13 +692,8 @@
         <w:t xml:space="preserve">Databases: </w:t>
       </w:r>
       <w:r>
-        <w:t xml:space="preserve">MySQL, PostgreSQL, </w:t>
-      </w:r>
-      <w:proofErr w:type="spellStart"/>
-      <w:r>
-        <w:t>Supabase</w:t>
-      </w:r>
-      <w:proofErr w:type="spellEnd"/>
+        <w:t>MySQL, PostgreSQL, Supabase</w:t>
+      </w:r>
     </w:p>
     <w:p>
       <w:r>
@@ -691,7 +715,7 @@
     <w:p>
       <w:pPr>
         <w:pBdr>
-          <w:bottom w:val="single" w:sz="6" w:space="1" w:color="1F4E78"/>
+          <w:bottom w:val="single" w:color="1F4E78" w:sz="6" w:space="1"/>
         </w:pBdr>
         <w:spacing w:before="240" w:after="120"/>
       </w:pPr>
@@ -750,7 +774,7 @@
     <w:p>
       <w:pPr>
         <w:pBdr>
-          <w:bottom w:val="single" w:sz="6" w:space="1" w:color="1F4E78"/>
+          <w:bottom w:val="single" w:color="1F4E78" w:sz="6" w:space="1"/>
         </w:pBdr>
         <w:spacing w:before="240" w:after="120"/>
       </w:pPr>
@@ -767,8 +791,10 @@
     </w:p>
     <w:p>
       <w:r>
-        <w:t>English (Professional) • Burmese (Native) • Rakhine (Native)</w:t>
-      </w:r>
+        <w:t xml:space="preserve">English (Professional) • Burmese (Native) </w:t>
+      </w:r>
+      <w:bookmarkStart w:id="0" w:name="_GoBack"/>
+      <w:bookmarkEnd w:id="0"/>
     </w:p>
     <w:p>
       <w:pPr>
@@ -778,7 +804,7 @@
     <w:p>
       <w:pPr>
         <w:pBdr>
-          <w:bottom w:val="single" w:sz="6" w:space="1" w:color="1F4E78"/>
+          <w:bottom w:val="single" w:color="1F4E78" w:sz="6" w:space="1"/>
         </w:pBdr>
         <w:spacing w:before="240" w:after="120"/>
       </w:pPr>
@@ -840,7 +866,7 @@
     <w:p>
       <w:pPr>
         <w:pBdr>
-          <w:bottom w:val="single" w:sz="6" w:space="1" w:color="1F4E78"/>
+          <w:bottom w:val="single" w:color="1F4E78" w:sz="6" w:space="1"/>
         </w:pBdr>
         <w:spacing w:before="240" w:after="120"/>
       </w:pPr>
@@ -857,21 +883,34 @@
     </w:p>
     <w:p>
       <w:pPr>
-        <w:pStyle w:val="ListParagraph"/>
+        <w:pStyle w:val="17"/>
         <w:numPr>
           <w:ilvl w:val="0"/>
           <w:numId w:val="1"/>
         </w:numPr>
         <w:spacing w:after="60"/>
       </w:pPr>
-      <w:hyperlink r:id="rId5" w:history="1">
-        <w:r>
-          <w:rPr>
-            <w:rStyle w:val="Hyperlink"/>
-          </w:rPr>
-          <w:t>AWS Certified AI Practitioner (AIF-C01)</w:t>
-        </w:r>
-      </w:hyperlink>
+      <w:r>
+        <w:fldChar w:fldCharType="begin"/>
+      </w:r>
+      <w:r>
+        <w:instrText xml:space="preserve"> HYPERLINK "https://www.credly.com/badges/4962f7d9-43ab-4c1f-bad1-f97f3610f073/public_url" </w:instrText>
+      </w:r>
+      <w:r>
+        <w:fldChar w:fldCharType="separate"/>
+      </w:r>
+      <w:r>
+        <w:rPr>
+          <w:rStyle w:val="15"/>
+        </w:rPr>
+        <w:t>AWS Certified AI Practitioner (AIF-C01)</w:t>
+      </w:r>
+      <w:r>
+        <w:rPr>
+          <w:rStyle w:val="15"/>
+        </w:rPr>
+        <w:fldChar w:fldCharType="end"/>
+      </w:r>
       <w:r>
         <w:t xml:space="preserve"> </w:t>
       </w:r>
@@ -879,134 +918,76 @@
         <w:rPr>
           <w:color w:val="2C3E50"/>
         </w:rPr>
-        <w:t>—</w:t>
-      </w:r>
-      <w:r>
-        <w:rPr>
-          <w:color w:val="2C3E50"/>
-        </w:rPr>
-        <w:t xml:space="preserve"> </w:t>
-      </w:r>
-      <w:r>
-        <w:rPr>
-          <w:color w:val="2C3E50"/>
-        </w:rPr>
-        <w:t>Amazon Web Services</w:t>
-      </w:r>
-      <w:r>
-        <w:rPr>
-          <w:color w:val="2C3E50"/>
-        </w:rPr>
-        <w:t xml:space="preserve"> (</w:t>
-      </w:r>
-      <w:r>
-        <w:rPr>
-          <w:color w:val="2C3E50"/>
-        </w:rPr>
-        <w:t>July</w:t>
-      </w:r>
-      <w:r>
-        <w:rPr>
-          <w:color w:val="2C3E50"/>
-        </w:rPr>
-        <w:t xml:space="preserve"> 2026</w:t>
-      </w:r>
-      <w:r>
-        <w:rPr>
-          <w:color w:val="2C3E50"/>
-        </w:rPr>
-        <w:t>)</w:t>
-      </w:r>
-    </w:p>
-    <w:p>
-      <w:pPr>
-        <w:pStyle w:val="ListParagraph"/>
+        <w:t>— Amazon Web Services (July 2026)</w:t>
+      </w:r>
+    </w:p>
+    <w:p>
+      <w:pPr>
+        <w:pStyle w:val="17"/>
         <w:numPr>
           <w:ilvl w:val="0"/>
           <w:numId w:val="1"/>
         </w:numPr>
         <w:spacing w:after="60"/>
       </w:pPr>
-      <w:hyperlink r:id="rId6" w:history="1">
-        <w:r>
-          <w:rPr>
-            <w:rStyle w:val="Hyperlink"/>
-          </w:rPr>
-          <w:t>AWS Cloud Practitioner (CLF-C02)</w:t>
-        </w:r>
-        <w:r>
-          <w:rPr>
-            <w:rStyle w:val="Hyperlink"/>
-          </w:rPr>
-          <w:t xml:space="preserve"> Training Complete</w:t>
-        </w:r>
-      </w:hyperlink>
-      <w:r>
-        <w:rPr>
-          <w:color w:val="2C3E50"/>
-        </w:rPr>
-        <w:t xml:space="preserve"> —</w:t>
-      </w:r>
-      <w:r>
-        <w:rPr>
-          <w:color w:val="2C3E50"/>
-        </w:rPr>
-        <w:t xml:space="preserve"> </w:t>
-      </w:r>
-      <w:r>
-        <w:rPr>
-          <w:color w:val="2C3E50"/>
-        </w:rPr>
-        <w:t>Amazon Web Services</w:t>
-      </w:r>
-      <w:r>
-        <w:rPr>
-          <w:color w:val="2C3E50"/>
-        </w:rPr>
-        <w:t xml:space="preserve"> (</w:t>
-      </w:r>
-      <w:r>
-        <w:rPr>
-          <w:color w:val="2C3E50"/>
-        </w:rPr>
-        <w:t>Ju</w:t>
-      </w:r>
-      <w:r>
-        <w:rPr>
-          <w:color w:val="2C3E50"/>
-        </w:rPr>
-        <w:t>ne</w:t>
-      </w:r>
-      <w:r>
-        <w:rPr>
-          <w:color w:val="2C3E50"/>
-        </w:rPr>
-        <w:t xml:space="preserve"> 2026</w:t>
-      </w:r>
-      <w:r>
-        <w:rPr>
-          <w:color w:val="2C3E50"/>
-        </w:rPr>
-        <w:t>)</w:t>
-      </w:r>
-    </w:p>
-    <w:p>
-      <w:pPr>
-        <w:pStyle w:val="ListParagraph"/>
+      <w:r>
+        <w:fldChar w:fldCharType="begin"/>
+      </w:r>
+      <w:r>
+        <w:instrText xml:space="preserve"> HYPERLINK "https://kaizarthwe.com/TrainingComplete.pdf" </w:instrText>
+      </w:r>
+      <w:r>
+        <w:fldChar w:fldCharType="separate"/>
+      </w:r>
+      <w:r>
+        <w:rPr>
+          <w:rStyle w:val="15"/>
+        </w:rPr>
+        <w:t>AWS Cloud Practitioner (CLF-C02) Training Complete</w:t>
+      </w:r>
+      <w:r>
+        <w:rPr>
+          <w:rStyle w:val="15"/>
+        </w:rPr>
+        <w:fldChar w:fldCharType="end"/>
+      </w:r>
+      <w:r>
+        <w:rPr>
+          <w:color w:val="2C3E50"/>
+        </w:rPr>
+        <w:t xml:space="preserve"> — Amazon Web Services (June 2026)</w:t>
+      </w:r>
+    </w:p>
+    <w:p>
+      <w:pPr>
+        <w:pStyle w:val="17"/>
         <w:numPr>
           <w:ilvl w:val="0"/>
           <w:numId w:val="1"/>
         </w:numPr>
         <w:spacing w:after="60"/>
       </w:pPr>
-      <w:hyperlink r:id="rId7" w:history="1">
-        <w:r>
-          <w:rPr>
-            <w:rStyle w:val="Hyperlink"/>
-          </w:rPr>
-          <w:t>Software Testing/QA</w:t>
-        </w:r>
-      </w:hyperlink>
+      <w:r>
+        <w:fldChar w:fldCharType="begin"/>
+      </w:r>
+      <w:r>
+        <w:instrText xml:space="preserve"> HYPERLINK "https://kaizarthwe.com/linkedinSoftwareTesting.pdf" </w:instrText>
+      </w:r>
+      <w:r>
+        <w:fldChar w:fldCharType="separate"/>
+      </w:r>
+      <w:r>
+        <w:rPr>
+          <w:rStyle w:val="15"/>
+        </w:rPr>
+        <w:t>Software Testing/QA</w:t>
+      </w:r>
+      <w:r>
+        <w:rPr>
+          <w:rStyle w:val="15"/>
+        </w:rPr>
+        <w:fldChar w:fldCharType="end"/>
+      </w:r>
       <w:r>
         <w:rPr>
           <w:color w:val="2C3E50"/>
@@ -1016,21 +997,34 @@
     </w:p>
     <w:p>
       <w:pPr>
-        <w:pStyle w:val="ListParagraph"/>
+        <w:pStyle w:val="17"/>
         <w:numPr>
           <w:ilvl w:val="0"/>
           <w:numId w:val="1"/>
         </w:numPr>
         <w:spacing w:after="60"/>
       </w:pPr>
-      <w:hyperlink r:id="rId8" w:history="1">
-        <w:r>
-          <w:rPr>
-            <w:rStyle w:val="Hyperlink"/>
-          </w:rPr>
-          <w:t>AI Ethics &amp; Governance (Associate Level)</w:t>
-        </w:r>
-      </w:hyperlink>
+      <w:r>
+        <w:fldChar w:fldCharType="begin"/>
+      </w:r>
+      <w:r>
+        <w:instrText xml:space="preserve"> HYPERLINK "https://kaizarthwe.com/AIEthicsGovernance.png" </w:instrText>
+      </w:r>
+      <w:r>
+        <w:fldChar w:fldCharType="separate"/>
+      </w:r>
+      <w:r>
+        <w:rPr>
+          <w:rStyle w:val="15"/>
+        </w:rPr>
+        <w:t>AI Ethics &amp; Governance (Associate Level)</w:t>
+      </w:r>
+      <w:r>
+        <w:rPr>
+          <w:rStyle w:val="15"/>
+        </w:rPr>
+        <w:fldChar w:fldCharType="end"/>
+      </w:r>
       <w:r>
         <w:rPr>
           <w:color w:val="2C3E50"/>
@@ -1040,21 +1034,34 @@
     </w:p>
     <w:p>
       <w:pPr>
-        <w:pStyle w:val="ListParagraph"/>
+        <w:pStyle w:val="17"/>
         <w:numPr>
           <w:ilvl w:val="0"/>
           <w:numId w:val="1"/>
         </w:numPr>
         <w:spacing w:after="60"/>
       </w:pPr>
-      <w:hyperlink r:id="rId9" w:history="1">
-        <w:r>
-          <w:rPr>
-            <w:rStyle w:val="Hyperlink"/>
-          </w:rPr>
-          <w:t>S Pass Eligibility Letter</w:t>
-        </w:r>
-      </w:hyperlink>
+      <w:r>
+        <w:fldChar w:fldCharType="begin"/>
+      </w:r>
+      <w:r>
+        <w:instrText xml:space="preserve"> HYPERLINK "https://kaizarthwe.com/S_Pass_Eligibility_Letter.pdf" </w:instrText>
+      </w:r>
+      <w:r>
+        <w:fldChar w:fldCharType="separate"/>
+      </w:r>
+      <w:r>
+        <w:rPr>
+          <w:rStyle w:val="15"/>
+        </w:rPr>
+        <w:t>S Pass Eligibility Letter</w:t>
+      </w:r>
+      <w:r>
+        <w:rPr>
+          <w:rStyle w:val="15"/>
+        </w:rPr>
+        <w:fldChar w:fldCharType="end"/>
+      </w:r>
       <w:r>
         <w:rPr>
           <w:color w:val="2C3E50"/>
@@ -1064,7 +1071,7 @@
     </w:p>
     <w:p>
       <w:pPr>
-        <w:pStyle w:val="ListParagraph"/>
+        <w:pStyle w:val="17"/>
         <w:spacing w:after="60"/>
         <w:ind w:left="360"/>
       </w:pPr>
@@ -1072,20 +1079,20 @@
     <w:sectPr>
       <w:pgSz w:w="11906" w:h="16838"/>
       <w:pgMar w:top="720" w:right="720" w:bottom="720" w:left="720" w:header="708" w:footer="708" w:gutter="0"/>
-      <w:cols w:space="720"/>
-      <w:docGrid w:linePitch="360"/>
+      <w:cols w:space="720" w:num="1"/>
+      <w:docGrid w:linePitch="360" w:charSpace="0"/>
     </w:sectPr>
   </w:body>
 </w:document>
 </file>
 
 <file path=word/numbering.xml><?xml version="1.0" encoding="utf-8"?>
-<w:numbering xmlns:wpc="http://schemas.microsoft.com/office/word/2010/wordprocessingCanvas" xmlns:cx="http://schemas.microsoft.com/office/drawing/2014/chartex" xmlns:cx1="http://schemas.microsoft.com/office/drawing/2015/9/8/chartex" xmlns:cx2="http://schemas.microsoft.com/office/drawing/2015/10/21/chartex" xmlns:cx3="http://schemas.microsoft.com/office/drawing/2016/5/9/chartex" xmlns:cx4="http://schemas.microsoft.com/office/drawing/2016/5/10/chartex" xmlns:cx5="http://schemas.microsoft.com/office/drawing/2016/5/11/chartex" xmlns:cx6="http://schemas.microsoft.com/office/drawing/2016/5/12/chartex" xmlns:cx7="http://schemas.microsoft.com/office/drawing/2016/5/13/chartex" xmlns:cx8="http://schemas.microsoft.com/office/drawing/2016/5/14/chartex" xmlns:mc="http://schemas.openxmlformats.org/markup-compatibility/2006" xmlns:aink="http://schemas.microsoft.com/office/drawing/2016/ink" xmlns:am3d="http://schemas.microsoft.com/office/drawing/2017/model3d" xmlns:o="urn:schemas-microsoft-com:office:office" xmlns:oel="http://schemas.microsoft.com/office/2019/extlst" xmlns:r="http://schemas.openxmlformats.org/officeDocument/2006/relationships" xmlns:m="http://schemas.openxmlformats.org/officeDocument/2006/math" xmlns:v="urn:schemas-microsoft-com:vml" xmlns:wp14="http://schemas.microsoft.com/office/word/2010/wordprocessingDrawing" xmlns:wp="http://schemas.openxmlformats.org/drawingml/2006/wordprocessingDrawing" xmlns:w10="urn:schemas-microsoft-com:office:word" xmlns:w="http://schemas.openxmlformats.org/wordprocessingml/2006/main" xmlns:w14="http://schemas.microsoft.com/office/word/2010/wordml" xmlns:w15="http://schemas.microsoft.com/office/word/2012/wordml" xmlns:w16cex="http://schemas.microsoft.com/office/word/2018/wordml/cex" xmlns:w16cid="http://schemas.microsoft.com/office/word/2016/wordml/cid" xmlns:w16="http://schemas.microsoft.com/office/word/2018/wordml" xmlns:w16du="http://schemas.microsoft.com/office/word/2023/wordml/word16du" xmlns:w16sdtdh="http://schemas.microsoft.com/office/word/2020/wordml/sdtdatahash" xmlns:w16sdtfl="http://schemas.microsoft.com/office/word/2024/wordml/sdtformatlock" xmlns:w16se="http://schemas.microsoft.com/office/word/2015/wordml/symex" xmlns:wpg="http://schemas.microsoft.com/office/word/2010/wordprocessingGroup" xmlns:wpi="http://schemas.microsoft.com/office/word/2010/wordprocessingInk" xmlns:wne="http://schemas.microsoft.com/office/word/2006/wordml" xmlns:wps="http://schemas.microsoft.com/office/word/2010/wordprocessingShape" mc:Ignorable="w14 w15 w16se w16cid w16 w16cex w16sdtdh w16sdtfl w16du wp14">
-  <w:abstractNum w:abstractNumId="0" w15:restartNumberingAfterBreak="0">
+<w:numbering xmlns:wpc="http://schemas.microsoft.com/office/word/2010/wordprocessingCanvas" xmlns:mc="http://schemas.openxmlformats.org/markup-compatibility/2006" xmlns:o="urn:schemas-microsoft-com:office:office" xmlns:r="http://schemas.openxmlformats.org/officeDocument/2006/relationships" xmlns:m="http://schemas.openxmlformats.org/officeDocument/2006/math" xmlns:v="urn:schemas-microsoft-com:vml" xmlns:wp14="http://schemas.microsoft.com/office/word/2010/wordprocessingDrawing" xmlns:wp="http://schemas.openxmlformats.org/drawingml/2006/wordprocessingDrawing" xmlns:w10="urn:schemas-microsoft-com:office:word" xmlns:w="http://schemas.openxmlformats.org/wordprocessingml/2006/main" xmlns:w14="http://schemas.microsoft.com/office/word/2010/wordml" xmlns:wpg="http://schemas.microsoft.com/office/word/2010/wordprocessingGroup" xmlns:wpi="http://schemas.microsoft.com/office/word/2010/wordprocessingInk" xmlns:wne="http://schemas.microsoft.com/office/word/2006/wordml" xmlns:wps="http://schemas.microsoft.com/office/word/2010/wordprocessingShape" xmlns:wpsCustomData="http://www.wps.cn/officeDocument/2013/wpsCustomData" mc:Ignorable="w14 wp14">
+  <w:abstractNum w:abstractNumId="0">
     <w:nsid w:val="0053208E"/>
     <w:multiLevelType w:val="singleLevel"/>
     <w:tmpl w:val="0053208E"/>
-    <w:lvl w:ilvl="0">
+    <w:lvl w:ilvl="0" w:tentative="0">
       <w:start w:val="1"/>
       <w:numFmt w:val="decimal"/>
       <w:lvlText w:val="•"/>
@@ -1095,7 +1102,7 @@
       </w:pPr>
     </w:lvl>
   </w:abstractNum>
-  <w:num w:numId="1" w16cid:durableId="1411391977">
+  <w:num w:numId="1">
     <w:abstractNumId w:val="0"/>
     <w:lvlOverride w:ilvl="0">
       <w:startOverride w:val="1"/>
@@ -1105,416 +1112,389 @@
 </file>
 
 <file path=word/styles.xml><?xml version="1.0" encoding="utf-8"?>
-<w:styles xmlns:mc="http://schemas.openxmlformats.org/markup-compatibility/2006" xmlns:r="http://schemas.openxmlformats.org/officeDocument/2006/relationships" xmlns:w="http://schemas.openxmlformats.org/wordprocessingml/2006/main" xmlns:w14="http://schemas.microsoft.com/office/word/2010/wordml" xmlns:w15="http://schemas.microsoft.com/office/word/2012/wordml" xmlns:w16cex="http://schemas.microsoft.com/office/word/2018/wordml/cex" xmlns:w16cid="http://schemas.microsoft.com/office/word/2016/wordml/cid" xmlns:w16="http://schemas.microsoft.com/office/word/2018/wordml" xmlns:w16du="http://schemas.microsoft.com/office/word/2023/wordml/word16du" xmlns:w16sdtdh="http://schemas.microsoft.com/office/word/2020/wordml/sdtdatahash" xmlns:w16sdtfl="http://schemas.microsoft.com/office/word/2024/wordml/sdtformatlock" xmlns:w16se="http://schemas.microsoft.com/office/word/2015/wordml/symex" mc:Ignorable="w14 w15 w16se w16cid w16 w16cex w16sdtdh w16sdtfl w16du">
+<w:styles xmlns:mc="http://schemas.openxmlformats.org/markup-compatibility/2006" xmlns:o="urn:schemas-microsoft-com:office:office" xmlns:r="http://schemas.openxmlformats.org/officeDocument/2006/relationships" xmlns:m="http://schemas.openxmlformats.org/officeDocument/2006/math" xmlns:v="urn:schemas-microsoft-com:vml" xmlns:w="http://schemas.openxmlformats.org/wordprocessingml/2006/main" xmlns:w14="http://schemas.microsoft.com/office/word/2010/wordml" xmlns:w10="urn:schemas-microsoft-com:office:word" xmlns:sl="http://schemas.openxmlformats.org/schemaLibrary/2006/main" xmlns:wpsCustomData="http://www.wps.cn/officeDocument/2013/wpsCustomData" mc:Ignorable="w14">
   <w:docDefaults>
     <w:rPrDefault>
       <w:rPr>
-        <w:rFonts w:ascii="Times New Roman" w:eastAsia="SimSun" w:hAnsi="Times New Roman" w:cs="Times New Roman"/>
-        <w:lang w:val="en-SG" w:eastAsia="en-SG" w:bidi="my-MM"/>
+        <w:rFonts w:ascii="Times New Roman" w:hAnsi="Times New Roman" w:eastAsia="SimSun" w:cs="Times New Roman"/>
       </w:rPr>
     </w:rPrDefault>
     <w:pPrDefault/>
   </w:docDefaults>
-  <w:latentStyles w:defLockedState="0" w:defUIPriority="0" w:defSemiHidden="0" w:defUnhideWhenUsed="0" w:defQFormat="0" w:count="376">
-    <w:lsdException w:name="Normal" w:qFormat="1"/>
-    <w:lsdException w:name="heading 1" w:qFormat="1"/>
-    <w:lsdException w:name="heading 2" w:qFormat="1"/>
-    <w:lsdException w:name="heading 3" w:qFormat="1"/>
-    <w:lsdException w:name="heading 4" w:qFormat="1"/>
-    <w:lsdException w:name="heading 5" w:qFormat="1"/>
-    <w:lsdException w:name="heading 6" w:qFormat="1"/>
-    <w:lsdException w:name="heading 7" w:semiHidden="1" w:unhideWhenUsed="1" w:qFormat="1"/>
-    <w:lsdException w:name="heading 8" w:semiHidden="1" w:unhideWhenUsed="1" w:qFormat="1"/>
-    <w:lsdException w:name="heading 9" w:semiHidden="1" w:unhideWhenUsed="1" w:qFormat="1"/>
-    <w:lsdException w:name="footnote text" w:semiHidden="1" w:uiPriority="99" w:unhideWhenUsed="1" w:qFormat="1"/>
-    <w:lsdException w:name="caption" w:semiHidden="1" w:unhideWhenUsed="1" w:qFormat="1"/>
-    <w:lsdException w:name="footnote reference" w:semiHidden="1" w:uiPriority="99" w:unhideWhenUsed="1" w:qFormat="1"/>
-    <w:lsdException w:name="endnote reference" w:semiHidden="1" w:uiPriority="99" w:unhideWhenUsed="1" w:qFormat="1"/>
-    <w:lsdException w:name="endnote text" w:semiHidden="1" w:uiPriority="99" w:unhideWhenUsed="1" w:qFormat="1"/>
-    <w:lsdException w:name="Title" w:qFormat="1"/>
-    <w:lsdException w:name="Default Paragraph Font" w:semiHidden="1" w:qFormat="1"/>
-    <w:lsdException w:name="Subtitle" w:qFormat="1"/>
-    <w:lsdException w:name="Hyperlink" w:uiPriority="99" w:unhideWhenUsed="1" w:qFormat="1"/>
-    <w:lsdException w:name="Strong" w:qFormat="1"/>
-    <w:lsdException w:name="Emphasis" w:qFormat="1"/>
-    <w:lsdException w:name="HTML Top of Form" w:semiHidden="1" w:uiPriority="99" w:unhideWhenUsed="1"/>
-    <w:lsdException w:name="HTML Bottom of Form" w:semiHidden="1" w:uiPriority="99" w:unhideWhenUsed="1"/>
-    <w:lsdException w:name="Normal Table" w:semiHidden="1" w:unhideWhenUsed="1" w:qFormat="1"/>
-    <w:lsdException w:name="No List" w:semiHidden="1" w:uiPriority="99" w:unhideWhenUsed="1"/>
-    <w:lsdException w:name="Outline List 1" w:semiHidden="1" w:uiPriority="99" w:unhideWhenUsed="1"/>
-    <w:lsdException w:name="Outline List 2" w:semiHidden="1" w:uiPriority="99" w:unhideWhenUsed="1"/>
-    <w:lsdException w:name="Outline List 3" w:semiHidden="1" w:uiPriority="99" w:unhideWhenUsed="1"/>
-    <w:lsdException w:name="Table Simple 1" w:semiHidden="1" w:unhideWhenUsed="1"/>
-    <w:lsdException w:name="Table Simple 2" w:semiHidden="1" w:unhideWhenUsed="1"/>
-    <w:lsdException w:name="Table Simple 3" w:semiHidden="1" w:unhideWhenUsed="1"/>
-    <w:lsdException w:name="Table Classic 1" w:semiHidden="1" w:unhideWhenUsed="1"/>
-    <w:lsdException w:name="Table Classic 2" w:semiHidden="1" w:unhideWhenUsed="1"/>
-    <w:lsdException w:name="Table Classic 3" w:semiHidden="1" w:unhideWhenUsed="1"/>
-    <w:lsdException w:name="Table Classic 4" w:semiHidden="1" w:unhideWhenUsed="1"/>
-    <w:lsdException w:name="Table Colorful 1" w:semiHidden="1" w:unhideWhenUsed="1"/>
-    <w:lsdException w:name="Table Colorful 2" w:semiHidden="1" w:unhideWhenUsed="1"/>
-    <w:lsdException w:name="Table Colorful 3" w:semiHidden="1" w:unhideWhenUsed="1"/>
-    <w:lsdException w:name="Table Columns 1" w:semiHidden="1" w:unhideWhenUsed="1"/>
-    <w:lsdException w:name="Table Columns 2" w:semiHidden="1" w:unhideWhenUsed="1"/>
-    <w:lsdException w:name="Table Columns 3" w:semiHidden="1" w:unhideWhenUsed="1"/>
-    <w:lsdException w:name="Table Columns 4" w:semiHidden="1" w:unhideWhenUsed="1"/>
-    <w:lsdException w:name="Table Columns 5" w:semiHidden="1" w:unhideWhenUsed="1"/>
-    <w:lsdException w:name="Table Grid 1" w:semiHidden="1" w:unhideWhenUsed="1"/>
-    <w:lsdException w:name="Table Grid 2" w:semiHidden="1" w:unhideWhenUsed="1"/>
-    <w:lsdException w:name="Table Grid 3" w:semiHidden="1" w:unhideWhenUsed="1"/>
-    <w:lsdException w:name="Table Grid 4" w:semiHidden="1" w:unhideWhenUsed="1"/>
-    <w:lsdException w:name="Table Grid 5" w:semiHidden="1" w:unhideWhenUsed="1"/>
-    <w:lsdException w:name="Table Grid 6" w:semiHidden="1" w:unhideWhenUsed="1"/>
-    <w:lsdException w:name="Table Grid 7" w:semiHidden="1" w:unhideWhenUsed="1"/>
-    <w:lsdException w:name="Table Grid 8" w:semiHidden="1" w:unhideWhenUsed="1"/>
-    <w:lsdException w:name="Table List 1" w:semiHidden="1" w:unhideWhenUsed="1"/>
-    <w:lsdException w:name="Table List 2" w:semiHidden="1" w:unhideWhenUsed="1"/>
-    <w:lsdException w:name="Table List 3" w:semiHidden="1" w:unhideWhenUsed="1"/>
-    <w:lsdException w:name="Table List 4" w:semiHidden="1" w:unhideWhenUsed="1"/>
-    <w:lsdException w:name="Table List 5" w:semiHidden="1" w:unhideWhenUsed="1"/>
-    <w:lsdException w:name="Table List 6" w:semiHidden="1" w:unhideWhenUsed="1"/>
-    <w:lsdException w:name="Table List 7" w:semiHidden="1" w:unhideWhenUsed="1"/>
-    <w:lsdException w:name="Table List 8" w:semiHidden="1" w:unhideWhenUsed="1"/>
-    <w:lsdException w:name="Table 3D effects 1" w:semiHidden="1" w:unhideWhenUsed="1"/>
-    <w:lsdException w:name="Table 3D effects 2" w:semiHidden="1" w:unhideWhenUsed="1"/>
-    <w:lsdException w:name="Table 3D effects 3" w:semiHidden="1" w:unhideWhenUsed="1"/>
-    <w:lsdException w:name="Table Contemporary" w:semiHidden="1" w:unhideWhenUsed="1"/>
-    <w:lsdException w:name="Table Elegant" w:semiHidden="1" w:unhideWhenUsed="1"/>
-    <w:lsdException w:name="Table Professional" w:semiHidden="1" w:unhideWhenUsed="1"/>
-    <w:lsdException w:name="Table Subtle 1" w:semiHidden="1" w:unhideWhenUsed="1"/>
-    <w:lsdException w:name="Table Subtle 2" w:semiHidden="1" w:unhideWhenUsed="1"/>
-    <w:lsdException w:name="Table Web 1" w:semiHidden="1" w:unhideWhenUsed="1"/>
-    <w:lsdException w:name="Table Web 2" w:semiHidden="1" w:unhideWhenUsed="1"/>
-    <w:lsdException w:name="Table Web 3" w:semiHidden="1" w:unhideWhenUsed="1"/>
-    <w:lsdException w:name="Table Theme" w:semiHidden="1" w:unhideWhenUsed="1"/>
-    <w:lsdException w:name="Placeholder Text" w:semiHidden="1" w:uiPriority="99" w:unhideWhenUsed="1"/>
-    <w:lsdException w:name="No Spacing" w:semiHidden="1" w:uiPriority="99" w:unhideWhenUsed="1"/>
-    <w:lsdException w:name="Light Shading" w:uiPriority="60"/>
-    <w:lsdException w:name="Light List" w:uiPriority="61"/>
-    <w:lsdException w:name="Light Grid" w:uiPriority="62"/>
-    <w:lsdException w:name="Medium Shading 1" w:uiPriority="63"/>
-    <w:lsdException w:name="Medium Shading 2" w:uiPriority="64"/>
-    <w:lsdException w:name="Medium List 1" w:uiPriority="65"/>
-    <w:lsdException w:name="Medium List 2" w:uiPriority="66"/>
-    <w:lsdException w:name="Medium Grid 1" w:uiPriority="67"/>
-    <w:lsdException w:name="Medium Grid 2" w:uiPriority="68"/>
-    <w:lsdException w:name="Medium Grid 3" w:uiPriority="69"/>
-    <w:lsdException w:name="Dark List" w:uiPriority="70"/>
-    <w:lsdException w:name="Colorful Shading" w:uiPriority="71"/>
-    <w:lsdException w:name="Colorful List" w:uiPriority="72"/>
-    <w:lsdException w:name="Colorful Grid" w:uiPriority="73"/>
-    <w:lsdException w:name="Light Shading Accent 1" w:uiPriority="60"/>
-    <w:lsdException w:name="Light List Accent 1" w:uiPriority="61"/>
-    <w:lsdException w:name="Light Grid Accent 1" w:uiPriority="62"/>
-    <w:lsdException w:name="Medium Shading 1 Accent 1" w:uiPriority="63"/>
-    <w:lsdException w:name="Medium Shading 2 Accent 1" w:uiPriority="64"/>
-    <w:lsdException w:name="Medium List 1 Accent 1" w:uiPriority="65"/>
-    <w:lsdException w:name="Revision" w:semiHidden="1" w:uiPriority="99" w:unhideWhenUsed="1"/>
-    <w:lsdException w:name="List Paragraph" w:qFormat="1"/>
-    <w:lsdException w:name="Quote" w:semiHidden="1" w:uiPriority="99" w:unhideWhenUsed="1"/>
-    <w:lsdException w:name="Intense Quote" w:semiHidden="1" w:uiPriority="99" w:unhideWhenUsed="1"/>
-    <w:lsdException w:name="Medium List 2 Accent 1" w:uiPriority="66"/>
-    <w:lsdException w:name="Medium Grid 1 Accent 1" w:uiPriority="67"/>
-    <w:lsdException w:name="Medium Grid 2 Accent 1" w:uiPriority="68"/>
-    <w:lsdException w:name="Medium Grid 3 Accent 1" w:uiPriority="69"/>
-    <w:lsdException w:name="Dark List Accent 1" w:uiPriority="70"/>
-    <w:lsdException w:name="Colorful Shading Accent 1" w:uiPriority="71"/>
-    <w:lsdException w:name="Colorful List Accent 1" w:uiPriority="72"/>
-    <w:lsdException w:name="Colorful Grid Accent 1" w:uiPriority="73"/>
-    <w:lsdException w:name="Light Shading Accent 2" w:uiPriority="60"/>
-    <w:lsdException w:name="Light List Accent 2" w:uiPriority="61"/>
-    <w:lsdException w:name="Light Grid Accent 2" w:uiPriority="62"/>
-    <w:lsdException w:name="Medium Shading 1 Accent 2" w:uiPriority="63"/>
-    <w:lsdException w:name="Medium Shading 2 Accent 2" w:uiPriority="64"/>
-    <w:lsdException w:name="Medium List 1 Accent 2" w:uiPriority="65"/>
-    <w:lsdException w:name="Medium List 2 Accent 2" w:uiPriority="66"/>
-    <w:lsdException w:name="Medium Grid 1 Accent 2" w:uiPriority="67"/>
-    <w:lsdException w:name="Medium Grid 2 Accent 2" w:uiPriority="68"/>
-    <w:lsdException w:name="Medium Grid 3 Accent 2" w:uiPriority="69"/>
-    <w:lsdException w:name="Dark List Accent 2" w:uiPriority="70"/>
-    <w:lsdException w:name="Colorful Shading Accent 2" w:uiPriority="71"/>
-    <w:lsdException w:name="Colorful List Accent 2" w:uiPriority="72"/>
-    <w:lsdException w:name="Colorful Grid Accent 2" w:uiPriority="73"/>
-    <w:lsdException w:name="Light Shading Accent 3" w:uiPriority="60"/>
-    <w:lsdException w:name="Light List Accent 3" w:uiPriority="61"/>
-    <w:lsdException w:name="Light Grid Accent 3" w:uiPriority="62"/>
-    <w:lsdException w:name="Medium Shading 1 Accent 3" w:uiPriority="63"/>
-    <w:lsdException w:name="Medium Shading 2 Accent 3" w:uiPriority="64"/>
-    <w:lsdException w:name="Medium List 1 Accent 3" w:uiPriority="65"/>
-    <w:lsdException w:name="Medium List 2 Accent 3" w:uiPriority="66"/>
-    <w:lsdException w:name="Medium Grid 1 Accent 3" w:uiPriority="67"/>
-    <w:lsdException w:name="Medium Grid 2 Accent 3" w:uiPriority="68"/>
-    <w:lsdException w:name="Medium Grid 3 Accent 3" w:uiPriority="69"/>
-    <w:lsdException w:name="Dark List Accent 3" w:uiPriority="70"/>
-    <w:lsdException w:name="Colorful Shading Accent 3" w:uiPriority="71"/>
-    <w:lsdException w:name="Colorful List Accent 3" w:uiPriority="72"/>
-    <w:lsdException w:name="Colorful Grid Accent 3" w:uiPriority="73"/>
-    <w:lsdException w:name="Light Shading Accent 4" w:uiPriority="60"/>
-    <w:lsdException w:name="Light List Accent 4" w:uiPriority="61"/>
-    <w:lsdException w:name="Light Grid Accent 4" w:uiPriority="62"/>
-    <w:lsdException w:name="Medium Shading 1 Accent 4" w:uiPriority="63"/>
-    <w:lsdException w:name="Medium Shading 2 Accent 4" w:uiPriority="64"/>
-    <w:lsdException w:name="Medium List 1 Accent 4" w:uiPriority="65"/>
-    <w:lsdException w:name="Medium List 2 Accent 4" w:uiPriority="66"/>
-    <w:lsdException w:name="Medium Grid 1 Accent 4" w:uiPriority="67"/>
-    <w:lsdException w:name="Medium Grid 2 Accent 4" w:uiPriority="68"/>
-    <w:lsdException w:name="Medium Grid 3 Accent 4" w:uiPriority="69"/>
-    <w:lsdException w:name="Dark List Accent 4" w:uiPriority="70"/>
-    <w:lsdException w:name="Colorful Shading Accent 4" w:uiPriority="71"/>
-    <w:lsdException w:name="Colorful List Accent 4" w:uiPriority="72"/>
-    <w:lsdException w:name="Colorful Grid Accent 4" w:uiPriority="73"/>
-    <w:lsdException w:name="Light Shading Accent 5" w:uiPriority="60"/>
-    <w:lsdException w:name="Light List Accent 5" w:uiPriority="61"/>
-    <w:lsdException w:name="Light Grid Accent 5" w:uiPriority="62"/>
-    <w:lsdException w:name="Medium Shading 1 Accent 5" w:uiPriority="63"/>
-    <w:lsdException w:name="Medium Shading 2 Accent 5" w:uiPriority="64"/>
-    <w:lsdException w:name="Medium List 1 Accent 5" w:uiPriority="65"/>
-    <w:lsdException w:name="Medium List 2 Accent 5" w:uiPriority="66"/>
-    <w:lsdException w:name="Medium Grid 1 Accent 5" w:uiPriority="67"/>
-    <w:lsdException w:name="Medium Grid 2 Accent 5" w:uiPriority="68"/>
-    <w:lsdException w:name="Medium Grid 3 Accent 5" w:uiPriority="69"/>
-    <w:lsdException w:name="Dark List Accent 5" w:uiPriority="70"/>
-    <w:lsdException w:name="Colorful Shading Accent 5" w:uiPriority="71"/>
-    <w:lsdException w:name="Colorful List Accent 5" w:uiPriority="72"/>
-    <w:lsdException w:name="Colorful Grid Accent 5" w:uiPriority="73"/>
-    <w:lsdException w:name="Light Shading Accent 6" w:uiPriority="60"/>
-    <w:lsdException w:name="Light List Accent 6" w:uiPriority="61"/>
-    <w:lsdException w:name="Light Grid Accent 6" w:uiPriority="62"/>
-    <w:lsdException w:name="Medium Shading 1 Accent 6" w:uiPriority="63"/>
-    <w:lsdException w:name="Medium Shading 2 Accent 6" w:uiPriority="64"/>
-    <w:lsdException w:name="Medium List 1 Accent 6" w:uiPriority="65"/>
-    <w:lsdException w:name="Medium List 2 Accent 6" w:uiPriority="66"/>
-    <w:lsdException w:name="Medium Grid 1 Accent 6" w:uiPriority="67"/>
-    <w:lsdException w:name="Medium Grid 2 Accent 6" w:uiPriority="68"/>
-    <w:lsdException w:name="Medium Grid 3 Accent 6" w:uiPriority="69"/>
-    <w:lsdException w:name="Dark List Accent 6" w:uiPriority="70"/>
-    <w:lsdException w:name="Colorful Shading Accent 6" w:uiPriority="71"/>
-    <w:lsdException w:name="Colorful List Accent 6" w:uiPriority="72"/>
-    <w:lsdException w:name="Colorful Grid Accent 6" w:uiPriority="73"/>
-    <w:lsdException w:name="Subtle Emphasis" w:uiPriority="19" w:qFormat="1"/>
-    <w:lsdException w:name="Intense Emphasis" w:uiPriority="21" w:qFormat="1"/>
-    <w:lsdException w:name="Subtle Reference" w:uiPriority="31" w:qFormat="1"/>
-    <w:lsdException w:name="Intense Reference" w:uiPriority="32" w:qFormat="1"/>
-    <w:lsdException w:name="Book Title" w:uiPriority="33" w:qFormat="1"/>
-    <w:lsdException w:name="Bibliography" w:semiHidden="1" w:uiPriority="37" w:unhideWhenUsed="1"/>
-    <w:lsdException w:name="TOC Heading" w:semiHidden="1" w:uiPriority="39" w:unhideWhenUsed="1" w:qFormat="1"/>
-    <w:lsdException w:name="Plain Table 1" w:uiPriority="41"/>
-    <w:lsdException w:name="Plain Table 2" w:uiPriority="42"/>
-    <w:lsdException w:name="Plain Table 3" w:uiPriority="43"/>
-    <w:lsdException w:name="Plain Table 4" w:uiPriority="44"/>
-    <w:lsdException w:name="Plain Table 5" w:uiPriority="45"/>
-    <w:lsdException w:name="Grid Table Light" w:uiPriority="40"/>
-    <w:lsdException w:name="Grid Table 1 Light" w:uiPriority="46"/>
-    <w:lsdException w:name="Grid Table 2" w:uiPriority="47"/>
-    <w:lsdException w:name="Grid Table 3" w:uiPriority="48"/>
-    <w:lsdException w:name="Grid Table 4" w:uiPriority="49"/>
-    <w:lsdException w:name="Grid Table 5 Dark" w:uiPriority="50"/>
-    <w:lsdException w:name="Grid Table 6 Colorful" w:uiPriority="51"/>
-    <w:lsdException w:name="Grid Table 7 Colorful" w:uiPriority="52"/>
-    <w:lsdException w:name="Grid Table 1 Light Accent 1" w:uiPriority="46"/>
-    <w:lsdException w:name="Grid Table 2 Accent 1" w:uiPriority="47"/>
-    <w:lsdException w:name="Grid Table 3 Accent 1" w:uiPriority="48"/>
-    <w:lsdException w:name="Grid Table 4 Accent 1" w:uiPriority="49"/>
-    <w:lsdException w:name="Grid Table 5 Dark Accent 1" w:uiPriority="50"/>
-    <w:lsdException w:name="Grid Table 6 Colorful Accent 1" w:uiPriority="51"/>
-    <w:lsdException w:name="Grid Table 7 Colorful Accent 1" w:uiPriority="52"/>
-    <w:lsdException w:name="Grid Table 1 Light Accent 2" w:uiPriority="46"/>
-    <w:lsdException w:name="Grid Table 2 Accent 2" w:uiPriority="47"/>
-    <w:lsdException w:name="Grid Table 3 Accent 2" w:uiPriority="48"/>
-    <w:lsdException w:name="Grid Table 4 Accent 2" w:uiPriority="49"/>
-    <w:lsdException w:name="Grid Table 5 Dark Accent 2" w:uiPriority="50"/>
-    <w:lsdException w:name="Grid Table 6 Colorful Accent 2" w:uiPriority="51"/>
-    <w:lsdException w:name="Grid Table 7 Colorful Accent 2" w:uiPriority="52"/>
-    <w:lsdException w:name="Grid Table 1 Light Accent 3" w:uiPriority="46"/>
-    <w:lsdException w:name="Grid Table 2 Accent 3" w:uiPriority="47"/>
-    <w:lsdException w:name="Grid Table 3 Accent 3" w:uiPriority="48"/>
-    <w:lsdException w:name="Grid Table 4 Accent 3" w:uiPriority="49"/>
-    <w:lsdException w:name="Grid Table 5 Dark Accent 3" w:uiPriority="50"/>
-    <w:lsdException w:name="Grid Table 6 Colorful Accent 3" w:uiPriority="51"/>
-    <w:lsdException w:name="Grid Table 7 Colorful Accent 3" w:uiPriority="52"/>
-    <w:lsdException w:name="Grid Table 1 Light Accent 4" w:uiPriority="46"/>
-    <w:lsdException w:name="Grid Table 2 Accent 4" w:uiPriority="47"/>
-    <w:lsdException w:name="Grid Table 3 Accent 4" w:uiPriority="48"/>
-    <w:lsdException w:name="Grid Table 4 Accent 4" w:uiPriority="49"/>
-    <w:lsdException w:name="Grid Table 5 Dark Accent 4" w:uiPriority="50"/>
-    <w:lsdException w:name="Grid Table 6 Colorful Accent 4" w:uiPriority="51"/>
-    <w:lsdException w:name="Grid Table 7 Colorful Accent 4" w:uiPriority="52"/>
-    <w:lsdException w:name="Grid Table 1 Light Accent 5" w:uiPriority="46"/>
-    <w:lsdException w:name="Grid Table 2 Accent 5" w:uiPriority="47"/>
-    <w:lsdException w:name="Grid Table 3 Accent 5" w:uiPriority="48"/>
-    <w:lsdException w:name="Grid Table 4 Accent 5" w:uiPriority="49"/>
-    <w:lsdException w:name="Grid Table 5 Dark Accent 5" w:uiPriority="50"/>
-    <w:lsdException w:name="Grid Table 6 Colorful Accent 5" w:uiPriority="51"/>
-    <w:lsdException w:name="Grid Table 7 Colorful Accent 5" w:uiPriority="52"/>
-    <w:lsdException w:name="Grid Table 1 Light Accent 6" w:uiPriority="46"/>
-    <w:lsdException w:name="Grid Table 2 Accent 6" w:uiPriority="47"/>
-    <w:lsdException w:name="Grid Table 3 Accent 6" w:uiPriority="48"/>
-    <w:lsdException w:name="Grid Table 4 Accent 6" w:uiPriority="49"/>
-    <w:lsdException w:name="Grid Table 5 Dark Accent 6" w:uiPriority="50"/>
-    <w:lsdException w:name="Grid Table 6 Colorful Accent 6" w:uiPriority="51"/>
-    <w:lsdException w:name="Grid Table 7 Colorful Accent 6" w:uiPriority="52"/>
-    <w:lsdException w:name="List Table 1 Light" w:uiPriority="46"/>
-    <w:lsdException w:name="List Table 2" w:uiPriority="47"/>
-    <w:lsdException w:name="List Table 3" w:uiPriority="48"/>
-    <w:lsdException w:name="List Table 4" w:uiPriority="49"/>
-    <w:lsdException w:name="List Table 5 Dark" w:uiPriority="50"/>
-    <w:lsdException w:name="List Table 6 Colorful" w:uiPriority="51"/>
-    <w:lsdException w:name="List Table 7 Colorful" w:uiPriority="52"/>
-    <w:lsdException w:name="List Table 1 Light Accent 1" w:uiPriority="46"/>
-    <w:lsdException w:name="List Table 2 Accent 1" w:uiPriority="47"/>
-    <w:lsdException w:name="List Table 3 Accent 1" w:uiPriority="48"/>
-    <w:lsdException w:name="List Table 4 Accent 1" w:uiPriority="49"/>
-    <w:lsdException w:name="List Table 5 Dark Accent 1" w:uiPriority="50"/>
-    <w:lsdException w:name="List Table 6 Colorful Accent 1" w:uiPriority="51"/>
-    <w:lsdException w:name="List Table 7 Colorful Accent 1" w:uiPriority="52"/>
-    <w:lsdException w:name="List Table 1 Light Accent 2" w:uiPriority="46"/>
-    <w:lsdException w:name="List Table 2 Accent 2" w:uiPriority="47"/>
-    <w:lsdException w:name="List Table 3 Accent 2" w:uiPriority="48"/>
-    <w:lsdException w:name="List Table 4 Accent 2" w:uiPriority="49"/>
-    <w:lsdException w:name="List Table 5 Dark Accent 2" w:uiPriority="50"/>
-    <w:lsdException w:name="List Table 6 Colorful Accent 2" w:uiPriority="51"/>
-    <w:lsdException w:name="List Table 7 Colorful Accent 2" w:uiPriority="52"/>
-    <w:lsdException w:name="List Table 1 Light Accent 3" w:uiPriority="46"/>
-    <w:lsdException w:name="List Table 2 Accent 3" w:uiPriority="47"/>
-    <w:lsdException w:name="List Table 3 Accent 3" w:uiPriority="48"/>
-    <w:lsdException w:name="List Table 4 Accent 3" w:uiPriority="49"/>
-    <w:lsdException w:name="List Table 5 Dark Accent 3" w:uiPriority="50"/>
-    <w:lsdException w:name="List Table 6 Colorful Accent 3" w:uiPriority="51"/>
-    <w:lsdException w:name="List Table 7 Colorful Accent 3" w:uiPriority="52"/>
-    <w:lsdException w:name="List Table 1 Light Accent 4" w:uiPriority="46"/>
-    <w:lsdException w:name="List Table 2 Accent 4" w:uiPriority="47"/>
-    <w:lsdException w:name="List Table 3 Accent 4" w:uiPriority="48"/>
-    <w:lsdException w:name="List Table 4 Accent 4" w:uiPriority="49"/>
-    <w:lsdException w:name="List Table 5 Dark Accent 4" w:uiPriority="50"/>
-    <w:lsdException w:name="List Table 6 Colorful Accent 4" w:uiPriority="51"/>
-    <w:lsdException w:name="List Table 7 Colorful Accent 4" w:uiPriority="52"/>
-    <w:lsdException w:name="List Table 1 Light Accent 5" w:uiPriority="46"/>
-    <w:lsdException w:name="List Table 2 Accent 5" w:uiPriority="47"/>
-    <w:lsdException w:name="List Table 3 Accent 5" w:uiPriority="48"/>
-    <w:lsdException w:name="List Table 4 Accent 5" w:uiPriority="49"/>
-    <w:lsdException w:name="List Table 5 Dark Accent 5" w:uiPriority="50"/>
-    <w:lsdException w:name="List Table 6 Colorful Accent 5" w:uiPriority="51"/>
-    <w:lsdException w:name="List Table 7 Colorful Accent 5" w:uiPriority="52"/>
-    <w:lsdException w:name="List Table 1 Light Accent 6" w:uiPriority="46"/>
-    <w:lsdException w:name="List Table 2 Accent 6" w:uiPriority="47"/>
-    <w:lsdException w:name="List Table 3 Accent 6" w:uiPriority="48"/>
-    <w:lsdException w:name="List Table 4 Accent 6" w:uiPriority="49"/>
-    <w:lsdException w:name="List Table 5 Dark Accent 6" w:uiPriority="50"/>
-    <w:lsdException w:name="List Table 6 Colorful Accent 6" w:uiPriority="51"/>
-    <w:lsdException w:name="List Table 7 Colorful Accent 6" w:uiPriority="52"/>
-    <w:lsdException w:name="Mention" w:semiHidden="1" w:uiPriority="99" w:unhideWhenUsed="1"/>
-    <w:lsdException w:name="Smart Hyperlink" w:semiHidden="1" w:uiPriority="99" w:unhideWhenUsed="1"/>
-    <w:lsdException w:name="Hashtag" w:semiHidden="1" w:uiPriority="99" w:unhideWhenUsed="1"/>
-    <w:lsdException w:name="Unresolved Mention" w:semiHidden="1" w:uiPriority="99" w:unhideWhenUsed="1"/>
-    <w:lsdException w:name="Smart Link" w:semiHidden="1" w:uiPriority="99" w:unhideWhenUsed="1"/>
+  <w:latentStyles w:count="260" w:defQFormat="0" w:defUnhideWhenUsed="1" w:defSemiHidden="1" w:defUIPriority="99" w:defLockedState="0">
+    <w:lsdException w:qFormat="1" w:unhideWhenUsed="0" w:uiPriority="0" w:semiHidden="0" w:name="Normal"/>
+    <w:lsdException w:qFormat="1" w:unhideWhenUsed="0" w:uiPriority="0" w:semiHidden="0" w:name="heading 1"/>
+    <w:lsdException w:qFormat="1" w:unhideWhenUsed="0" w:uiPriority="0" w:semiHidden="0" w:name="heading 2"/>
+    <w:lsdException w:qFormat="1" w:unhideWhenUsed="0" w:uiPriority="0" w:semiHidden="0" w:name="heading 3"/>
+    <w:lsdException w:qFormat="1" w:unhideWhenUsed="0" w:uiPriority="0" w:semiHidden="0" w:name="heading 4"/>
+    <w:lsdException w:qFormat="1" w:unhideWhenUsed="0" w:uiPriority="0" w:semiHidden="0" w:name="heading 5"/>
+    <w:lsdException w:qFormat="1" w:unhideWhenUsed="0" w:uiPriority="0" w:semiHidden="0" w:name="heading 6"/>
+    <w:lsdException w:qFormat="1" w:uiPriority="0" w:name="heading 7"/>
+    <w:lsdException w:qFormat="1" w:uiPriority="0" w:name="heading 8"/>
+    <w:lsdException w:qFormat="1" w:uiPriority="0" w:name="heading 9"/>
+    <w:lsdException w:unhideWhenUsed="0" w:uiPriority="0" w:semiHidden="0" w:name="index 1"/>
+    <w:lsdException w:unhideWhenUsed="0" w:uiPriority="0" w:semiHidden="0" w:name="index 2"/>
+    <w:lsdException w:unhideWhenUsed="0" w:uiPriority="0" w:semiHidden="0" w:name="index 3"/>
+    <w:lsdException w:unhideWhenUsed="0" w:uiPriority="0" w:semiHidden="0" w:name="index 4"/>
+    <w:lsdException w:unhideWhenUsed="0" w:uiPriority="0" w:semiHidden="0" w:name="index 5"/>
+    <w:lsdException w:unhideWhenUsed="0" w:uiPriority="0" w:semiHidden="0" w:name="index 6"/>
+    <w:lsdException w:unhideWhenUsed="0" w:uiPriority="0" w:semiHidden="0" w:name="index 7"/>
+    <w:lsdException w:unhideWhenUsed="0" w:uiPriority="0" w:semiHidden="0" w:name="index 8"/>
+    <w:lsdException w:unhideWhenUsed="0" w:uiPriority="0" w:semiHidden="0" w:name="index 9"/>
+    <w:lsdException w:unhideWhenUsed="0" w:uiPriority="0" w:semiHidden="0" w:name="toc 1"/>
+    <w:lsdException w:unhideWhenUsed="0" w:uiPriority="0" w:semiHidden="0" w:name="toc 2"/>
+    <w:lsdException w:unhideWhenUsed="0" w:uiPriority="0" w:semiHidden="0" w:name="toc 3"/>
+    <w:lsdException w:unhideWhenUsed="0" w:uiPriority="0" w:semiHidden="0" w:name="toc 4"/>
+    <w:lsdException w:unhideWhenUsed="0" w:uiPriority="0" w:semiHidden="0" w:name="toc 5"/>
+    <w:lsdException w:unhideWhenUsed="0" w:uiPriority="0" w:semiHidden="0" w:name="toc 6"/>
+    <w:lsdException w:unhideWhenUsed="0" w:uiPriority="0" w:semiHidden="0" w:name="toc 7"/>
+    <w:lsdException w:unhideWhenUsed="0" w:uiPriority="0" w:semiHidden="0" w:name="toc 8"/>
+    <w:lsdException w:unhideWhenUsed="0" w:uiPriority="0" w:semiHidden="0" w:name="toc 9"/>
+    <w:lsdException w:unhideWhenUsed="0" w:uiPriority="0" w:semiHidden="0" w:name="Normal Indent"/>
+    <w:lsdException w:qFormat="1" w:uiPriority="99" w:name="footnote text"/>
+    <w:lsdException w:unhideWhenUsed="0" w:uiPriority="0" w:semiHidden="0" w:name="annotation text"/>
+    <w:lsdException w:unhideWhenUsed="0" w:uiPriority="0" w:semiHidden="0" w:name="header"/>
+    <w:lsdException w:unhideWhenUsed="0" w:uiPriority="0" w:semiHidden="0" w:name="footer"/>
+    <w:lsdException w:unhideWhenUsed="0" w:uiPriority="0" w:semiHidden="0" w:name="index heading"/>
+    <w:lsdException w:qFormat="1" w:uiPriority="0" w:name="caption"/>
+    <w:lsdException w:unhideWhenUsed="0" w:uiPriority="0" w:semiHidden="0" w:name="table of figures"/>
+    <w:lsdException w:unhideWhenUsed="0" w:uiPriority="0" w:semiHidden="0" w:name="envelope address"/>
+    <w:lsdException w:unhideWhenUsed="0" w:uiPriority="0" w:semiHidden="0" w:name="envelope return"/>
+    <w:lsdException w:qFormat="1" w:uiPriority="99" w:name="footnote reference"/>
+    <w:lsdException w:unhideWhenUsed="0" w:uiPriority="0" w:semiHidden="0" w:name="annotation reference"/>
+    <w:lsdException w:unhideWhenUsed="0" w:uiPriority="0" w:semiHidden="0" w:name="line number"/>
+    <w:lsdException w:unhideWhenUsed="0" w:uiPriority="0" w:semiHidden="0" w:name="page number"/>
+    <w:lsdException w:qFormat="1" w:uiPriority="99" w:name="endnote reference"/>
+    <w:lsdException w:qFormat="1" w:uiPriority="99" w:name="endnote text"/>
+    <w:lsdException w:unhideWhenUsed="0" w:uiPriority="0" w:semiHidden="0" w:name="table of authorities"/>
+    <w:lsdException w:unhideWhenUsed="0" w:uiPriority="0" w:semiHidden="0" w:name="macro"/>
+    <w:lsdException w:unhideWhenUsed="0" w:uiPriority="0" w:semiHidden="0" w:name="toa heading"/>
+    <w:lsdException w:unhideWhenUsed="0" w:uiPriority="0" w:semiHidden="0" w:name="List"/>
+    <w:lsdException w:unhideWhenUsed="0" w:uiPriority="0" w:semiHidden="0" w:name="List Bullet"/>
+    <w:lsdException w:unhideWhenUsed="0" w:uiPriority="0" w:semiHidden="0" w:name="List Number"/>
+    <w:lsdException w:unhideWhenUsed="0" w:uiPriority="0" w:semiHidden="0" w:name="List 2"/>
+    <w:lsdException w:unhideWhenUsed="0" w:uiPriority="0" w:semiHidden="0" w:name="List 3"/>
+    <w:lsdException w:unhideWhenUsed="0" w:uiPriority="0" w:semiHidden="0" w:name="List 4"/>
+    <w:lsdException w:unhideWhenUsed="0" w:uiPriority="0" w:semiHidden="0" w:name="List 5"/>
+    <w:lsdException w:unhideWhenUsed="0" w:uiPriority="0" w:semiHidden="0" w:name="List Bullet 2"/>
+    <w:lsdException w:unhideWhenUsed="0" w:uiPriority="0" w:semiHidden="0" w:name="List Bullet 3"/>
+    <w:lsdException w:unhideWhenUsed="0" w:uiPriority="0" w:semiHidden="0" w:name="List Bullet 4"/>
+    <w:lsdException w:unhideWhenUsed="0" w:uiPriority="0" w:semiHidden="0" w:name="List Bullet 5"/>
+    <w:lsdException w:unhideWhenUsed="0" w:uiPriority="0" w:semiHidden="0" w:name="List Number 2"/>
+    <w:lsdException w:unhideWhenUsed="0" w:uiPriority="0" w:semiHidden="0" w:name="List Number 3"/>
+    <w:lsdException w:unhideWhenUsed="0" w:uiPriority="0" w:semiHidden="0" w:name="List Number 4"/>
+    <w:lsdException w:unhideWhenUsed="0" w:uiPriority="0" w:semiHidden="0" w:name="List Number 5"/>
+    <w:lsdException w:qFormat="1" w:unhideWhenUsed="0" w:uiPriority="0" w:semiHidden="0" w:name="Title"/>
+    <w:lsdException w:unhideWhenUsed="0" w:uiPriority="0" w:semiHidden="0" w:name="Closing"/>
+    <w:lsdException w:unhideWhenUsed="0" w:uiPriority="0" w:semiHidden="0" w:name="Signature"/>
+    <w:lsdException w:qFormat="1" w:uiPriority="1" w:name="Default Paragraph Font"/>
+    <w:lsdException w:unhideWhenUsed="0" w:uiPriority="0" w:semiHidden="0" w:name="Body Text"/>
+    <w:lsdException w:unhideWhenUsed="0" w:uiPriority="0" w:semiHidden="0" w:name="Body Text Indent"/>
+    <w:lsdException w:unhideWhenUsed="0" w:uiPriority="0" w:semiHidden="0" w:name="List Continue"/>
+    <w:lsdException w:unhideWhenUsed="0" w:uiPriority="0" w:semiHidden="0" w:name="List Continue 2"/>
+    <w:lsdException w:unhideWhenUsed="0" w:uiPriority="0" w:semiHidden="0" w:name="List Continue 3"/>
+    <w:lsdException w:unhideWhenUsed="0" w:uiPriority="0" w:semiHidden="0" w:name="List Continue 4"/>
+    <w:lsdException w:unhideWhenUsed="0" w:uiPriority="0" w:semiHidden="0" w:name="List Continue 5"/>
+    <w:lsdException w:unhideWhenUsed="0" w:uiPriority="0" w:semiHidden="0" w:name="Message Header"/>
+    <w:lsdException w:qFormat="1" w:unhideWhenUsed="0" w:uiPriority="0" w:semiHidden="0" w:name="Subtitle"/>
+    <w:lsdException w:unhideWhenUsed="0" w:uiPriority="0" w:semiHidden="0" w:name="Salutation"/>
+    <w:lsdException w:unhideWhenUsed="0" w:uiPriority="0" w:semiHidden="0" w:name="Date"/>
+    <w:lsdException w:unhideWhenUsed="0" w:uiPriority="0" w:semiHidden="0" w:name="Body Text First Indent"/>
+    <w:lsdException w:unhideWhenUsed="0" w:uiPriority="0" w:semiHidden="0" w:name="Body Text First Indent 2"/>
+    <w:lsdException w:unhideWhenUsed="0" w:uiPriority="0" w:semiHidden="0" w:name="Note Heading"/>
+    <w:lsdException w:unhideWhenUsed="0" w:uiPriority="0" w:semiHidden="0" w:name="Body Text 2"/>
+    <w:lsdException w:unhideWhenUsed="0" w:uiPriority="0" w:semiHidden="0" w:name="Body Text 3"/>
+    <w:lsdException w:unhideWhenUsed="0" w:uiPriority="0" w:semiHidden="0" w:name="Body Text Indent 2"/>
+    <w:lsdException w:unhideWhenUsed="0" w:uiPriority="0" w:semiHidden="0" w:name="Body Text Indent 3"/>
+    <w:lsdException w:unhideWhenUsed="0" w:uiPriority="0" w:semiHidden="0" w:name="Block Text"/>
+    <w:lsdException w:qFormat="1" w:uiPriority="99" w:semiHidden="0" w:name="Hyperlink"/>
+    <w:lsdException w:qFormat="1" w:unhideWhenUsed="0" w:uiPriority="0" w:semiHidden="0" w:name="FollowedHyperlink"/>
+    <w:lsdException w:qFormat="1" w:unhideWhenUsed="0" w:uiPriority="0" w:semiHidden="0" w:name="Strong"/>
+    <w:lsdException w:qFormat="1" w:unhideWhenUsed="0" w:uiPriority="0" w:semiHidden="0" w:name="Emphasis"/>
+    <w:lsdException w:unhideWhenUsed="0" w:uiPriority="0" w:semiHidden="0" w:name="Document Map"/>
+    <w:lsdException w:unhideWhenUsed="0" w:uiPriority="0" w:semiHidden="0" w:name="Plain Text"/>
+    <w:lsdException w:unhideWhenUsed="0" w:uiPriority="0" w:semiHidden="0" w:name="E-mail Signature"/>
+    <w:lsdException w:unhideWhenUsed="0" w:uiPriority="0" w:semiHidden="0" w:name="Normal (Web)"/>
+    <w:lsdException w:unhideWhenUsed="0" w:uiPriority="0" w:semiHidden="0" w:name="HTML Acronym"/>
+    <w:lsdException w:unhideWhenUsed="0" w:uiPriority="0" w:semiHidden="0" w:name="HTML Address"/>
+    <w:lsdException w:unhideWhenUsed="0" w:uiPriority="0" w:semiHidden="0" w:name="HTML Cite"/>
+    <w:lsdException w:unhideWhenUsed="0" w:uiPriority="0" w:semiHidden="0" w:name="HTML Code"/>
+    <w:lsdException w:unhideWhenUsed="0" w:uiPriority="0" w:semiHidden="0" w:name="HTML Definition"/>
+    <w:lsdException w:unhideWhenUsed="0" w:uiPriority="0" w:semiHidden="0" w:name="HTML Keyboard"/>
+    <w:lsdException w:unhideWhenUsed="0" w:uiPriority="0" w:semiHidden="0" w:name="HTML Preformatted"/>
+    <w:lsdException w:unhideWhenUsed="0" w:uiPriority="0" w:semiHidden="0" w:name="HTML Sample"/>
+    <w:lsdException w:unhideWhenUsed="0" w:uiPriority="0" w:semiHidden="0" w:name="HTML Typewriter"/>
+    <w:lsdException w:unhideWhenUsed="0" w:uiPriority="0" w:semiHidden="0" w:name="HTML Variable"/>
+    <w:lsdException w:qFormat="1" w:uiPriority="99" w:name="Normal Table"/>
+    <w:lsdException w:unhideWhenUsed="0" w:uiPriority="0" w:semiHidden="0" w:name="annotation subject"/>
+    <w:lsdException w:uiPriority="0" w:name="Table Simple 1"/>
+    <w:lsdException w:uiPriority="0" w:name="Table Simple 2"/>
+    <w:lsdException w:uiPriority="0" w:name="Table Simple 3"/>
+    <w:lsdException w:uiPriority="0" w:name="Table Classic 1"/>
+    <w:lsdException w:uiPriority="0" w:name="Table Classic 2"/>
+    <w:lsdException w:uiPriority="0" w:name="Table Classic 3"/>
+    <w:lsdException w:uiPriority="0" w:name="Table Classic 4"/>
+    <w:lsdException w:uiPriority="0" w:name="Table Colorful 1"/>
+    <w:lsdException w:uiPriority="0" w:name="Table Colorful 2"/>
+    <w:lsdException w:uiPriority="0" w:name="Table Colorful 3"/>
+    <w:lsdException w:uiPriority="0" w:name="Table Columns 1"/>
+    <w:lsdException w:uiPriority="0" w:name="Table Columns 2"/>
+    <w:lsdException w:uiPriority="0" w:name="Table Columns 3"/>
+    <w:lsdException w:uiPriority="0" w:name="Table Columns 4"/>
+    <w:lsdException w:uiPriority="0" w:name="Table Columns 5"/>
+    <w:lsdException w:uiPriority="0" w:name="Table Grid 1"/>
+    <w:lsdException w:uiPriority="0" w:name="Table Grid 2"/>
+    <w:lsdException w:uiPriority="0" w:name="Table Grid 3"/>
+    <w:lsdException w:uiPriority="0" w:name="Table Grid 4"/>
+    <w:lsdException w:uiPriority="0" w:name="Table Grid 5"/>
+    <w:lsdException w:uiPriority="0" w:name="Table Grid 6"/>
+    <w:lsdException w:uiPriority="0" w:name="Table Grid 7"/>
+    <w:lsdException w:uiPriority="0" w:name="Table Grid 8"/>
+    <w:lsdException w:uiPriority="0" w:name="Table List 1"/>
+    <w:lsdException w:uiPriority="0" w:name="Table List 2"/>
+    <w:lsdException w:uiPriority="0" w:name="Table List 3"/>
+    <w:lsdException w:uiPriority="0" w:name="Table List 4"/>
+    <w:lsdException w:uiPriority="0" w:name="Table List 5"/>
+    <w:lsdException w:uiPriority="0" w:name="Table List 6"/>
+    <w:lsdException w:uiPriority="0" w:name="Table List 7"/>
+    <w:lsdException w:uiPriority="0" w:name="Table List 8"/>
+    <w:lsdException w:uiPriority="0" w:name="Table 3D effects 1"/>
+    <w:lsdException w:uiPriority="0" w:name="Table 3D effects 2"/>
+    <w:lsdException w:uiPriority="0" w:name="Table 3D effects 3"/>
+    <w:lsdException w:uiPriority="0" w:name="Table Contemporary"/>
+    <w:lsdException w:uiPriority="0" w:name="Table Elegant"/>
+    <w:lsdException w:uiPriority="0" w:name="Table Professional"/>
+    <w:lsdException w:uiPriority="0" w:name="Table Subtle 1"/>
+    <w:lsdException w:uiPriority="0" w:name="Table Subtle 2"/>
+    <w:lsdException w:uiPriority="0" w:name="Table Web 1"/>
+    <w:lsdException w:uiPriority="0" w:name="Table Web 2"/>
+    <w:lsdException w:uiPriority="0" w:name="Table Web 3"/>
+    <w:lsdException w:unhideWhenUsed="0" w:uiPriority="0" w:semiHidden="0" w:name="Balloon Text"/>
+    <w:lsdException w:unhideWhenUsed="0" w:uiPriority="0" w:semiHidden="0" w:name="Table Grid"/>
+    <w:lsdException w:uiPriority="0" w:name="Table Theme"/>
+    <w:lsdException w:unhideWhenUsed="0" w:uiPriority="60" w:semiHidden="0" w:name="Light Shading"/>
+    <w:lsdException w:unhideWhenUsed="0" w:uiPriority="61" w:semiHidden="0" w:name="Light List"/>
+    <w:lsdException w:unhideWhenUsed="0" w:uiPriority="62" w:semiHidden="0" w:name="Light Grid"/>
+    <w:lsdException w:unhideWhenUsed="0" w:uiPriority="63" w:semiHidden="0" w:name="Medium Shading 1"/>
+    <w:lsdException w:unhideWhenUsed="0" w:uiPriority="64" w:semiHidden="0" w:name="Medium Shading 2"/>
+    <w:lsdException w:unhideWhenUsed="0" w:uiPriority="65" w:semiHidden="0" w:name="Medium List 1"/>
+    <w:lsdException w:unhideWhenUsed="0" w:uiPriority="66" w:semiHidden="0" w:name="Medium List 2"/>
+    <w:lsdException w:unhideWhenUsed="0" w:uiPriority="67" w:semiHidden="0" w:name="Medium Grid 1"/>
+    <w:lsdException w:unhideWhenUsed="0" w:uiPriority="68" w:semiHidden="0" w:name="Medium Grid 2"/>
+    <w:lsdException w:unhideWhenUsed="0" w:uiPriority="69" w:semiHidden="0" w:name="Medium Grid 3"/>
+    <w:lsdException w:unhideWhenUsed="0" w:uiPriority="70" w:semiHidden="0" w:name="Dark List"/>
+    <w:lsdException w:unhideWhenUsed="0" w:uiPriority="71" w:semiHidden="0" w:name="Colorful Shading"/>
+    <w:lsdException w:unhideWhenUsed="0" w:uiPriority="72" w:semiHidden="0" w:name="Colorful List"/>
+    <w:lsdException w:unhideWhenUsed="0" w:uiPriority="73" w:semiHidden="0" w:name="Colorful Grid"/>
+    <w:lsdException w:unhideWhenUsed="0" w:uiPriority="60" w:semiHidden="0" w:name="Light Shading Accent 1"/>
+    <w:lsdException w:unhideWhenUsed="0" w:uiPriority="61" w:semiHidden="0" w:name="Light List Accent 1"/>
+    <w:lsdException w:unhideWhenUsed="0" w:uiPriority="62" w:semiHidden="0" w:name="Light Grid Accent 1"/>
+    <w:lsdException w:unhideWhenUsed="0" w:uiPriority="63" w:semiHidden="0" w:name="Medium Shading 1 Accent 1"/>
+    <w:lsdException w:unhideWhenUsed="0" w:uiPriority="64" w:semiHidden="0" w:name="Medium Shading 2 Accent 1"/>
+    <w:lsdException w:unhideWhenUsed="0" w:uiPriority="65" w:semiHidden="0" w:name="Medium List 1 Accent 1"/>
+    <w:lsdException w:qFormat="1" w:unhideWhenUsed="0" w:uiPriority="0" w:semiHidden="0" w:name="List Paragraph"/>
+    <w:lsdException w:unhideWhenUsed="0" w:uiPriority="66" w:semiHidden="0" w:name="Medium List 2 Accent 1"/>
+    <w:lsdException w:unhideWhenUsed="0" w:uiPriority="67" w:semiHidden="0" w:name="Medium Grid 1 Accent 1"/>
+    <w:lsdException w:unhideWhenUsed="0" w:uiPriority="68" w:semiHidden="0" w:name="Medium Grid 2 Accent 1"/>
+    <w:lsdException w:unhideWhenUsed="0" w:uiPriority="69" w:semiHidden="0" w:name="Medium Grid 3 Accent 1"/>
+    <w:lsdException w:unhideWhenUsed="0" w:uiPriority="70" w:semiHidden="0" w:name="Dark List Accent 1"/>
+    <w:lsdException w:unhideWhenUsed="0" w:uiPriority="71" w:semiHidden="0" w:name="Colorful Shading Accent 1"/>
+    <w:lsdException w:unhideWhenUsed="0" w:uiPriority="72" w:semiHidden="0" w:name="Colorful List Accent 1"/>
+    <w:lsdException w:unhideWhenUsed="0" w:uiPriority="73" w:semiHidden="0" w:name="Colorful Grid Accent 1"/>
+    <w:lsdException w:unhideWhenUsed="0" w:uiPriority="60" w:semiHidden="0" w:name="Light Shading Accent 2"/>
+    <w:lsdException w:unhideWhenUsed="0" w:uiPriority="61" w:semiHidden="0" w:name="Light List Accent 2"/>
+    <w:lsdException w:unhideWhenUsed="0" w:uiPriority="62" w:semiHidden="0" w:name="Light Grid Accent 2"/>
+    <w:lsdException w:unhideWhenUsed="0" w:uiPriority="63" w:semiHidden="0" w:name="Medium Shading 1 Accent 2"/>
+    <w:lsdException w:unhideWhenUsed="0" w:uiPriority="64" w:semiHidden="0" w:name="Medium Shading 2 Accent 2"/>
+    <w:lsdException w:unhideWhenUsed="0" w:uiPriority="65" w:semiHidden="0" w:name="Medium List 1 Accent 2"/>
+    <w:lsdException w:unhideWhenUsed="0" w:uiPriority="66" w:semiHidden="0" w:name="Medium List 2 Accent 2"/>
+    <w:lsdException w:unhideWhenUsed="0" w:uiPriority="67" w:semiHidden="0" w:name="Medium Grid 1 Accent 2"/>
+    <w:lsdException w:unhideWhenUsed="0" w:uiPriority="68" w:semiHidden="0" w:name="Medium Grid 2 Accent 2"/>
+    <w:lsdException w:unhideWhenUsed="0" w:uiPriority="69" w:semiHidden="0" w:name="Medium Grid 3 Accent 2"/>
+    <w:lsdException w:unhideWhenUsed="0" w:uiPriority="70" w:semiHidden="0" w:name="Dark List Accent 2"/>
+    <w:lsdException w:unhideWhenUsed="0" w:uiPriority="71" w:semiHidden="0" w:name="Colorful Shading Accent 2"/>
+    <w:lsdException w:unhideWhenUsed="0" w:uiPriority="72" w:semiHidden="0" w:name="Colorful List Accent 2"/>
+    <w:lsdException w:unhideWhenUsed="0" w:uiPriority="73" w:semiHidden="0" w:name="Colorful Grid Accent 2"/>
+    <w:lsdException w:unhideWhenUsed="0" w:uiPriority="60" w:semiHidden="0" w:name="Light Shading Accent 3"/>
+    <w:lsdException w:unhideWhenUsed="0" w:uiPriority="61" w:semiHidden="0" w:name="Light List Accent 3"/>
+    <w:lsdException w:unhideWhenUsed="0" w:uiPriority="62" w:semiHidden="0" w:name="Light Grid Accent 3"/>
+    <w:lsdException w:unhideWhenUsed="0" w:uiPriority="63" w:semiHidden="0" w:name="Medium Shading 1 Accent 3"/>
+    <w:lsdException w:unhideWhenUsed="0" w:uiPriority="64" w:semiHidden="0" w:name="Medium Shading 2 Accent 3"/>
+    <w:lsdException w:unhideWhenUsed="0" w:uiPriority="65" w:semiHidden="0" w:name="Medium List 1 Accent 3"/>
+    <w:lsdException w:unhideWhenUsed="0" w:uiPriority="66" w:semiHidden="0" w:name="Medium List 2 Accent 3"/>
+    <w:lsdException w:unhideWhenUsed="0" w:uiPriority="67" w:semiHidden="0" w:name="Medium Grid 1 Accent 3"/>
+    <w:lsdException w:unhideWhenUsed="0" w:uiPriority="68" w:semiHidden="0" w:name="Medium Grid 2 Accent 3"/>
+    <w:lsdException w:unhideWhenUsed="0" w:uiPriority="69" w:semiHidden="0" w:name="Medium Grid 3 Accent 3"/>
+    <w:lsdException w:unhideWhenUsed="0" w:uiPriority="70" w:semiHidden="0" w:name="Dark List Accent 3"/>
+    <w:lsdException w:unhideWhenUsed="0" w:uiPriority="71" w:semiHidden="0" w:name="Colorful Shading Accent 3"/>
+    <w:lsdException w:unhideWhenUsed="0" w:uiPriority="72" w:semiHidden="0" w:name="Colorful List Accent 3"/>
+    <w:lsdException w:unhideWhenUsed="0" w:uiPriority="73" w:semiHidden="0" w:name="Colorful Grid Accent 3"/>
+    <w:lsdException w:unhideWhenUsed="0" w:uiPriority="60" w:semiHidden="0" w:name="Light Shading Accent 4"/>
+    <w:lsdException w:unhideWhenUsed="0" w:uiPriority="61" w:semiHidden="0" w:name="Light List Accent 4"/>
+    <w:lsdException w:unhideWhenUsed="0" w:uiPriority="62" w:semiHidden="0" w:name="Light Grid Accent 4"/>
+    <w:lsdException w:unhideWhenUsed="0" w:uiPriority="63" w:semiHidden="0" w:name="Medium Shading 1 Accent 4"/>
+    <w:lsdException w:unhideWhenUsed="0" w:uiPriority="64" w:semiHidden="0" w:name="Medium Shading 2 Accent 4"/>
+    <w:lsdException w:unhideWhenUsed="0" w:uiPriority="65" w:semiHidden="0" w:name="Medium List 1 Accent 4"/>
+    <w:lsdException w:unhideWhenUsed="0" w:uiPriority="66" w:semiHidden="0" w:name="Medium List 2 Accent 4"/>
+    <w:lsdException w:unhideWhenUsed="0" w:uiPriority="67" w:semiHidden="0" w:name="Medium Grid 1 Accent 4"/>
+    <w:lsdException w:unhideWhenUsed="0" w:uiPriority="68" w:semiHidden="0" w:name="Medium Grid 2 Accent 4"/>
+    <w:lsdException w:unhideWhenUsed="0" w:uiPriority="69" w:semiHidden="0" w:name="Medium Grid 3 Accent 4"/>
+    <w:lsdException w:unhideWhenUsed="0" w:uiPriority="70" w:semiHidden="0" w:name="Dark List Accent 4"/>
+    <w:lsdException w:unhideWhenUsed="0" w:uiPriority="71" w:semiHidden="0" w:name="Colorful Shading Accent 4"/>
+    <w:lsdException w:unhideWhenUsed="0" w:uiPriority="72" w:semiHidden="0" w:name="Colorful List Accent 4"/>
+    <w:lsdException w:unhideWhenUsed="0" w:uiPriority="73" w:semiHidden="0" w:name="Colorful Grid Accent 4"/>
+    <w:lsdException w:unhideWhenUsed="0" w:uiPriority="60" w:semiHidden="0" w:name="Light Shading Accent 5"/>
+    <w:lsdException w:unhideWhenUsed="0" w:uiPriority="61" w:semiHidden="0" w:name="Light List Accent 5"/>
+    <w:lsdException w:unhideWhenUsed="0" w:uiPriority="62" w:semiHidden="0" w:name="Light Grid Accent 5"/>
+    <w:lsdException w:unhideWhenUsed="0" w:uiPriority="63" w:semiHidden="0" w:name="Medium Shading 1 Accent 5"/>
+    <w:lsdException w:unhideWhenUsed="0" w:uiPriority="64" w:semiHidden="0" w:name="Medium Shading 2 Accent 5"/>
+    <w:lsdException w:unhideWhenUsed="0" w:uiPriority="65" w:semiHidden="0" w:name="Medium List 1 Accent 5"/>
+    <w:lsdException w:unhideWhenUsed="0" w:uiPriority="66" w:semiHidden="0" w:name="Medium List 2 Accent 5"/>
+    <w:lsdException w:unhideWhenUsed="0" w:uiPriority="67" w:semiHidden="0" w:name="Medium Grid 1 Accent 5"/>
+    <w:lsdException w:unhideWhenUsed="0" w:uiPriority="68" w:semiHidden="0" w:name="Medium Grid 2 Accent 5"/>
+    <w:lsdException w:unhideWhenUsed="0" w:uiPriority="69" w:semiHidden="0" w:name="Medium Grid 3 Accent 5"/>
+    <w:lsdException w:unhideWhenUsed="0" w:uiPriority="70" w:semiHidden="0" w:name="Dark List Accent 5"/>
+    <w:lsdException w:unhideWhenUsed="0" w:uiPriority="71" w:semiHidden="0" w:name="Colorful Shading Accent 5"/>
+    <w:lsdException w:unhideWhenUsed="0" w:uiPriority="72" w:semiHidden="0" w:name="Colorful List Accent 5"/>
+    <w:lsdException w:unhideWhenUsed="0" w:uiPriority="73" w:semiHidden="0" w:name="Colorful Grid Accent 5"/>
+    <w:lsdException w:unhideWhenUsed="0" w:uiPriority="60" w:semiHidden="0" w:name="Light Shading Accent 6"/>
+    <w:lsdException w:unhideWhenUsed="0" w:uiPriority="61" w:semiHidden="0" w:name="Light List Accent 6"/>
+    <w:lsdException w:unhideWhenUsed="0" w:uiPriority="62" w:semiHidden="0" w:name="Light Grid Accent 6"/>
+    <w:lsdException w:unhideWhenUsed="0" w:uiPriority="63" w:semiHidden="0" w:name="Medium Shading 1 Accent 6"/>
+    <w:lsdException w:unhideWhenUsed="0" w:uiPriority="64" w:semiHidden="0" w:name="Medium Shading 2 Accent 6"/>
+    <w:lsdException w:unhideWhenUsed="0" w:uiPriority="65" w:semiHidden="0" w:name="Medium List 1 Accent 6"/>
+    <w:lsdException w:unhideWhenUsed="0" w:uiPriority="66" w:semiHidden="0" w:name="Medium List 2 Accent 6"/>
+    <w:lsdException w:unhideWhenUsed="0" w:uiPriority="67" w:semiHidden="0" w:name="Medium Grid 1 Accent 6"/>
+    <w:lsdException w:unhideWhenUsed="0" w:uiPriority="68" w:semiHidden="0" w:name="Medium Grid 2 Accent 6"/>
+    <w:lsdException w:unhideWhenUsed="0" w:uiPriority="69" w:semiHidden="0" w:name="Medium Grid 3 Accent 6"/>
+    <w:lsdException w:unhideWhenUsed="0" w:uiPriority="70" w:semiHidden="0" w:name="Dark List Accent 6"/>
+    <w:lsdException w:unhideWhenUsed="0" w:uiPriority="71" w:semiHidden="0" w:name="Colorful Shading Accent 6"/>
+    <w:lsdException w:unhideWhenUsed="0" w:uiPriority="72" w:semiHidden="0" w:name="Colorful List Accent 6"/>
+    <w:lsdException w:unhideWhenUsed="0" w:uiPriority="73" w:semiHidden="0" w:name="Colorful Grid Accent 6"/>
   </w:latentStyles>
-  <w:style w:type="paragraph" w:default="1" w:styleId="Normal">
+  <w:style w:type="paragraph" w:default="1" w:styleId="1">
     <w:name w:val="Normal"/>
     <w:qFormat/>
+    <w:uiPriority w:val="0"/>
     <w:rPr>
-      <w:rFonts w:ascii="Calibri" w:eastAsia="Calibri" w:hAnsi="Calibri" w:cs="Calibri"/>
+      <w:rFonts w:ascii="Calibri" w:hAnsi="Calibri" w:eastAsia="Calibri" w:cs="Calibri"/>
       <w:sz w:val="22"/>
       <w:szCs w:val="22"/>
+      <w:lang w:val="en-SG" w:eastAsia="en-SG" w:bidi="zh-CN"/>
     </w:rPr>
   </w:style>
-  <w:style w:type="paragraph" w:styleId="Heading1">
+  <w:style w:type="paragraph" w:styleId="2">
     <w:name w:val="heading 1"/>
-    <w:next w:val="Normal"/>
+    <w:next w:val="1"/>
     <w:qFormat/>
+    <w:uiPriority w:val="0"/>
     <w:pPr>
       <w:outlineLvl w:val="0"/>
     </w:pPr>
     <w:rPr>
-      <w:rFonts w:ascii="Calibri" w:eastAsia="Calibri" w:hAnsi="Calibri" w:cs="Calibri"/>
+      <w:rFonts w:ascii="Calibri" w:hAnsi="Calibri" w:eastAsia="Calibri" w:cs="Calibri"/>
       <w:color w:val="2E74B5"/>
       <w:sz w:val="32"/>
       <w:szCs w:val="32"/>
+      <w:lang w:val="en-SG" w:eastAsia="en-SG" w:bidi="zh-CN"/>
     </w:rPr>
   </w:style>
-  <w:style w:type="paragraph" w:styleId="Heading2">
+  <w:style w:type="paragraph" w:styleId="3">
     <w:name w:val="heading 2"/>
-    <w:next w:val="Normal"/>
+    <w:next w:val="1"/>
     <w:qFormat/>
+    <w:uiPriority w:val="0"/>
     <w:pPr>
       <w:outlineLvl w:val="1"/>
     </w:pPr>
     <w:rPr>
-      <w:rFonts w:ascii="Calibri" w:eastAsia="Calibri" w:hAnsi="Calibri" w:cs="Calibri"/>
+      <w:rFonts w:ascii="Calibri" w:hAnsi="Calibri" w:eastAsia="Calibri" w:cs="Calibri"/>
       <w:color w:val="2E74B5"/>
       <w:sz w:val="26"/>
       <w:szCs w:val="26"/>
+      <w:lang w:val="en-SG" w:eastAsia="en-SG" w:bidi="zh-CN"/>
     </w:rPr>
   </w:style>
-  <w:style w:type="paragraph" w:styleId="Heading3">
+  <w:style w:type="paragraph" w:styleId="4">
     <w:name w:val="heading 3"/>
-    <w:next w:val="Normal"/>
+    <w:next w:val="1"/>
     <w:qFormat/>
+    <w:uiPriority w:val="0"/>
     <w:pPr>
       <w:outlineLvl w:val="2"/>
     </w:pPr>
     <w:rPr>
-      <w:rFonts w:ascii="Calibri" w:eastAsia="Calibri" w:hAnsi="Calibri" w:cs="Calibri"/>
+      <w:rFonts w:ascii="Calibri" w:hAnsi="Calibri" w:eastAsia="Calibri" w:cs="Calibri"/>
       <w:color w:val="1F4D78"/>
       <w:sz w:val="24"/>
       <w:szCs w:val="24"/>
+      <w:lang w:val="en-SG" w:eastAsia="en-SG" w:bidi="zh-CN"/>
     </w:rPr>
   </w:style>
-  <w:style w:type="paragraph" w:styleId="Heading4">
+  <w:style w:type="paragraph" w:styleId="5">
     <w:name w:val="heading 4"/>
-    <w:next w:val="Normal"/>
+    <w:next w:val="1"/>
     <w:qFormat/>
+    <w:uiPriority w:val="0"/>
     <w:pPr>
       <w:outlineLvl w:val="3"/>
     </w:pPr>
     <w:rPr>
-      <w:rFonts w:ascii="Calibri" w:eastAsia="Calibri" w:hAnsi="Calibri" w:cs="Calibri"/>
+      <w:rFonts w:ascii="Calibri" w:hAnsi="Calibri" w:eastAsia="Calibri" w:cs="Calibri"/>
       <w:i/>
       <w:iCs/>
       <w:color w:val="2E74B5"/>
       <w:sz w:val="22"/>
       <w:szCs w:val="22"/>
+      <w:lang w:val="en-SG" w:eastAsia="en-SG" w:bidi="zh-CN"/>
     </w:rPr>
   </w:style>
-  <w:style w:type="paragraph" w:styleId="Heading5">
+  <w:style w:type="paragraph" w:styleId="6">
     <w:name w:val="heading 5"/>
-    <w:next w:val="Normal"/>
+    <w:next w:val="1"/>
     <w:qFormat/>
+    <w:uiPriority w:val="0"/>
     <w:pPr>
       <w:outlineLvl w:val="4"/>
     </w:pPr>
     <w:rPr>
-      <w:rFonts w:ascii="Calibri" w:eastAsia="Calibri" w:hAnsi="Calibri" w:cs="Calibri"/>
+      <w:rFonts w:ascii="Calibri" w:hAnsi="Calibri" w:eastAsia="Calibri" w:cs="Calibri"/>
       <w:color w:val="2E74B5"/>
       <w:sz w:val="22"/>
       <w:szCs w:val="22"/>
+      <w:lang w:val="en-SG" w:eastAsia="en-SG" w:bidi="zh-CN"/>
     </w:rPr>
   </w:style>
-  <w:style w:type="paragraph" w:styleId="Heading6">
+  <w:style w:type="paragraph" w:styleId="7">
     <w:name w:val="heading 6"/>
-    <w:next w:val="Normal"/>
+    <w:next w:val="1"/>
     <w:qFormat/>
+    <w:uiPriority w:val="0"/>
     <w:pPr>
       <w:outlineLvl w:val="5"/>
     </w:pPr>
     <w:rPr>
-      <w:rFonts w:ascii="Calibri" w:eastAsia="Calibri" w:hAnsi="Calibri" w:cs="Calibri"/>
+      <w:rFonts w:ascii="Calibri" w:hAnsi="Calibri" w:eastAsia="Calibri" w:cs="Calibri"/>
       <w:color w:val="1F4D78"/>
       <w:sz w:val="22"/>
       <w:szCs w:val="22"/>
+      <w:lang w:val="en-SG" w:eastAsia="en-SG" w:bidi="zh-CN"/>
     </w:rPr>
   </w:style>
-  <w:style w:type="character" w:default="1" w:styleId="DefaultParagraphFont">
+  <w:style w:type="character" w:default="1" w:styleId="8">
     <w:name w:val="Default Paragraph Font"/>
-    <w:uiPriority w:val="1"/>
-    <w:unhideWhenUsed/>
-  </w:style>
-  <w:style w:type="table" w:default="1" w:styleId="TableNormal">
-    <w:name w:val="Normal Table"/>
-    <w:uiPriority w:val="99"/>
     <w:semiHidden/>
     <w:unhideWhenUsed/>
+    <w:qFormat/>
+    <w:uiPriority w:val="1"/>
+  </w:style>
+  <w:style w:type="table" w:default="1" w:styleId="9">
+    <w:name w:val="Normal Table"/>
+    <w:semiHidden/>
+    <w:unhideWhenUsed/>
+    <w:qFormat/>
+    <w:uiPriority w:val="99"/>
     <w:tblPr>
-      <w:tblInd w:w="0" w:type="dxa"/>
       <w:tblCellMar>
         <w:top w:w="0" w:type="dxa"/>
         <w:left w:w="108" w:type="dxa"/>
@@ -1523,113 +1503,123 @@
       </w:tblCellMar>
     </w:tblPr>
   </w:style>
-  <w:style w:type="numbering" w:default="1" w:styleId="NoList">
-    <w:name w:val="No List"/>
-    <w:uiPriority w:val="99"/>
-    <w:semiHidden/>
-    <w:unhideWhenUsed/>
-  </w:style>
-  <w:style w:type="character" w:styleId="EndnoteReference">
+  <w:style w:type="character" w:styleId="10">
     <w:name w:val="endnote reference"/>
-    <w:uiPriority w:val="99"/>
     <w:semiHidden/>
     <w:unhideWhenUsed/>
     <w:qFormat/>
+    <w:uiPriority w:val="99"/>
     <w:rPr>
       <w:vertAlign w:val="superscript"/>
     </w:rPr>
   </w:style>
-  <w:style w:type="paragraph" w:styleId="EndnoteText">
+  <w:style w:type="paragraph" w:styleId="11">
     <w:name w:val="endnote text"/>
-    <w:link w:val="EndnoteTextChar"/>
-    <w:uiPriority w:val="99"/>
+    <w:link w:val="19"/>
     <w:semiHidden/>
     <w:unhideWhenUsed/>
     <w:qFormat/>
+    <w:uiPriority w:val="99"/>
     <w:rPr>
-      <w:rFonts w:ascii="Calibri" w:eastAsia="Calibri" w:hAnsi="Calibri" w:cs="Calibri"/>
+      <w:rFonts w:ascii="Calibri" w:hAnsi="Calibri" w:eastAsia="Calibri" w:cs="Calibri"/>
+      <w:lang w:val="en-SG" w:eastAsia="en-SG" w:bidi="zh-CN"/>
     </w:rPr>
   </w:style>
-  <w:style w:type="character" w:styleId="FootnoteReference">
+  <w:style w:type="character" w:styleId="12">
+    <w:name w:val="FollowedHyperlink"/>
+    <w:basedOn w:val="8"/>
+    <w:qFormat/>
+    <w:uiPriority w:val="0"/>
+    <w:rPr>
+      <w:color w:val="800080"/>
+      <w:u w:val="single"/>
+    </w:rPr>
+  </w:style>
+  <w:style w:type="character" w:styleId="13">
     <w:name w:val="footnote reference"/>
-    <w:uiPriority w:val="99"/>
     <w:semiHidden/>
     <w:unhideWhenUsed/>
     <w:qFormat/>
+    <w:uiPriority w:val="99"/>
     <w:rPr>
       <w:vertAlign w:val="superscript"/>
     </w:rPr>
   </w:style>
-  <w:style w:type="paragraph" w:styleId="FootnoteText">
+  <w:style w:type="paragraph" w:styleId="14">
     <w:name w:val="footnote text"/>
-    <w:link w:val="FootnoteTextChar"/>
-    <w:uiPriority w:val="99"/>
+    <w:link w:val="18"/>
     <w:semiHidden/>
     <w:unhideWhenUsed/>
     <w:qFormat/>
+    <w:uiPriority w:val="99"/>
     <w:rPr>
-      <w:rFonts w:ascii="Calibri" w:eastAsia="Calibri" w:hAnsi="Calibri" w:cs="Calibri"/>
+      <w:rFonts w:ascii="Calibri" w:hAnsi="Calibri" w:eastAsia="Calibri" w:cs="Calibri"/>
+      <w:lang w:val="en-SG" w:eastAsia="en-SG" w:bidi="zh-CN"/>
     </w:rPr>
   </w:style>
-  <w:style w:type="character" w:styleId="Hyperlink">
+  <w:style w:type="character" w:styleId="15">
     <w:name w:val="Hyperlink"/>
-    <w:uiPriority w:val="99"/>
     <w:unhideWhenUsed/>
     <w:qFormat/>
+    <w:uiPriority w:val="99"/>
     <w:rPr>
       <w:color w:val="0563C1"/>
       <w:u w:val="single"/>
     </w:rPr>
   </w:style>
-  <w:style w:type="paragraph" w:styleId="Title">
+  <w:style w:type="paragraph" w:styleId="16">
     <w:name w:val="Title"/>
     <w:qFormat/>
+    <w:uiPriority w:val="0"/>
     <w:rPr>
-      <w:rFonts w:ascii="Calibri" w:eastAsia="Calibri" w:hAnsi="Calibri" w:cs="Calibri"/>
+      <w:rFonts w:ascii="Calibri" w:hAnsi="Calibri" w:eastAsia="Calibri" w:cs="Calibri"/>
       <w:sz w:val="56"/>
       <w:szCs w:val="56"/>
+      <w:lang w:val="en-SG" w:eastAsia="en-SG" w:bidi="zh-CN"/>
     </w:rPr>
   </w:style>
-  <w:style w:type="paragraph" w:styleId="ListParagraph">
+  <w:style w:type="paragraph" w:styleId="17">
     <w:name w:val="List Paragraph"/>
     <w:qFormat/>
+    <w:uiPriority w:val="0"/>
     <w:rPr>
-      <w:rFonts w:ascii="Calibri" w:eastAsia="Calibri" w:hAnsi="Calibri" w:cs="Calibri"/>
+      <w:rFonts w:ascii="Calibri" w:hAnsi="Calibri" w:eastAsia="Calibri" w:cs="Calibri"/>
       <w:sz w:val="22"/>
       <w:szCs w:val="22"/>
+      <w:lang w:val="en-SG" w:eastAsia="en-SG" w:bidi="zh-CN"/>
     </w:rPr>
   </w:style>
-  <w:style w:type="character" w:customStyle="1" w:styleId="FootnoteTextChar">
+  <w:style w:type="character" w:customStyle="1" w:styleId="18">
     <w:name w:val="Footnote Text Char"/>
-    <w:link w:val="FootnoteText"/>
-    <w:uiPriority w:val="99"/>
+    <w:link w:val="14"/>
     <w:semiHidden/>
     <w:unhideWhenUsed/>
     <w:qFormat/>
+    <w:uiPriority w:val="99"/>
     <w:rPr>
       <w:sz w:val="20"/>
       <w:szCs w:val="20"/>
     </w:rPr>
   </w:style>
-  <w:style w:type="character" w:customStyle="1" w:styleId="EndnoteTextChar">
+  <w:style w:type="character" w:customStyle="1" w:styleId="19">
     <w:name w:val="Endnote Text Char"/>
-    <w:link w:val="EndnoteText"/>
-    <w:uiPriority w:val="99"/>
+    <w:link w:val="11"/>
     <w:semiHidden/>
     <w:unhideWhenUsed/>
     <w:qFormat/>
+    <w:uiPriority w:val="99"/>
     <w:rPr>
       <w:sz w:val="20"/>
       <w:szCs w:val="20"/>
     </w:rPr>
   </w:style>
-  <w:style w:type="character" w:styleId="UnresolvedMention">
-    <w:name w:val="Unresolved Mention"/>
-    <w:basedOn w:val="DefaultParagraphFont"/>
-    <w:uiPriority w:val="99"/>
+  <w:style w:type="character" w:customStyle="1" w:styleId="20">
+    <w:name w:val="Unresolved Mention1"/>
+    <w:basedOn w:val="8"/>
     <w:semiHidden/>
     <w:unhideWhenUsed/>
-    <w:rsid w:val="00B95322"/>
+    <w:qFormat/>
+    <w:uiPriority w:val="99"/>
     <w:rPr>
       <w:color w:val="605E5C"/>
       <w:shd w:val="clear" w:color="auto" w:fill="E1DFDD"/>
@@ -1919,6 +1909,5 @@
     </a:fmtScheme>
   </a:themeElements>
   <a:objectDefaults/>
-  <a:extraClrSchemeLst/>
 </a:theme>
 </file>
</xml_diff>